<commit_message>
Updated readme docx for git commands.
</commit_message>
<xml_diff>
--- a/readme_vscode.docx
+++ b/readme_vscode.docx
@@ -1196,6 +1196,1819 @@
     </w:p>
     <w:p>
       <w:pPr>
+        <w:pStyle w:val="Heading2"/>
+        <w:numPr>
+          <w:ilvl w:val="0"/>
+          <w:numId w:val="7"/>
+        </w:numPr>
+        <w:rPr>
+          <w:rFonts w:ascii="Arial" w:hAnsi="Arial" w:cs="Arial"/>
+          <w:b/>
+          <w:bCs/>
+          <w:sz w:val="24"/>
+          <w:szCs w:val="24"/>
+        </w:rPr>
+      </w:pPr>
+      <w:r>
+        <w:rPr>
+          <w:rFonts w:ascii="Arial" w:hAnsi="Arial" w:cs="Arial"/>
+          <w:b/>
+          <w:bCs/>
+          <w:sz w:val="24"/>
+          <w:szCs w:val="24"/>
+        </w:rPr>
+        <w:t>Git Repository vs Python Virtual Environment</w:t>
+      </w:r>
+    </w:p>
+    <w:p>
+      <w:pPr>
+        <w:pStyle w:val="ListParagraph"/>
+        <w:spacing w:line="276" w:lineRule="auto"/>
+        <w:ind w:left="360"/>
+      </w:pPr>
+      <w:r>
+        <w:t>During setup, it is common to confuse the Git repository location with the Python virtual environment (</w:t>
+      </w:r>
+      <w:proofErr w:type="spellStart"/>
+      <w:r>
+        <w:t>venv</w:t>
+      </w:r>
+      <w:proofErr w:type="spellEnd"/>
+      <w:r>
+        <w:t>) location. They are separate concepts.</w:t>
+      </w:r>
+    </w:p>
+    <w:p>
+      <w:pPr>
+        <w:pStyle w:val="ListParagraph"/>
+        <w:spacing w:line="276" w:lineRule="auto"/>
+        <w:ind w:left="360"/>
+        <w:rPr>
+          <w:b/>
+          <w:bCs/>
+        </w:rPr>
+      </w:pPr>
+      <w:r>
+        <w:rPr>
+          <w:b/>
+          <w:bCs/>
+        </w:rPr>
+        <w:t>Example from my setup</w:t>
+      </w:r>
+      <w:r>
+        <w:rPr>
+          <w:b/>
+          <w:bCs/>
+        </w:rPr>
+        <w:t>:</w:t>
+      </w:r>
+    </w:p>
+    <w:p>
+      <w:pPr>
+        <w:pStyle w:val="ListParagraph"/>
+        <w:numPr>
+          <w:ilvl w:val="0"/>
+          <w:numId w:val="20"/>
+        </w:numPr>
+        <w:spacing w:before="120" w:line="276" w:lineRule="auto"/>
+        <w:rPr>
+          <w:b/>
+          <w:bCs/>
+        </w:rPr>
+      </w:pPr>
+      <w:r>
+        <w:rPr>
+          <w:b/>
+          <w:bCs/>
+        </w:rPr>
+        <w:t>Repository root:</w:t>
+      </w:r>
+      <w:r>
+        <w:rPr>
+          <w:b/>
+          <w:bCs/>
+        </w:rPr>
+        <w:t xml:space="preserve"> </w:t>
+      </w:r>
+      <w:r>
+        <w:t>D:\Github</w:t>
+      </w:r>
+    </w:p>
+    <w:p>
+      <w:pPr>
+        <w:pStyle w:val="ListParagraph"/>
+        <w:numPr>
+          <w:ilvl w:val="0"/>
+          <w:numId w:val="20"/>
+        </w:numPr>
+        <w:spacing w:before="120" w:line="276" w:lineRule="auto"/>
+        <w:rPr>
+          <w:b/>
+          <w:bCs/>
+        </w:rPr>
+      </w:pPr>
+      <w:r>
+        <w:rPr>
+          <w:b/>
+          <w:bCs/>
+        </w:rPr>
+        <w:t>Virtual environment:</w:t>
+      </w:r>
+      <w:r>
+        <w:rPr>
+          <w:b/>
+          <w:bCs/>
+        </w:rPr>
+        <w:t xml:space="preserve"> </w:t>
+      </w:r>
+      <w:r>
+        <w:t>D:\Github\vaibhav</w:t>
+      </w:r>
+    </w:p>
+    <w:p>
+      <w:pPr>
+        <w:pStyle w:val="ListParagraph"/>
+        <w:numPr>
+          <w:ilvl w:val="0"/>
+          <w:numId w:val="20"/>
+        </w:numPr>
+        <w:spacing w:before="120" w:line="276" w:lineRule="auto"/>
+        <w:rPr>
+          <w:b/>
+          <w:bCs/>
+        </w:rPr>
+      </w:pPr>
+      <w:r>
+        <w:rPr>
+          <w:b/>
+          <w:bCs/>
+        </w:rPr>
+        <w:t>Repository structure:</w:t>
+      </w:r>
+    </w:p>
+    <w:p>
+      <w:pPr>
+        <w:pStyle w:val="ListParagraph"/>
+        <w:spacing w:line="276" w:lineRule="auto"/>
+        <w:ind w:left="360"/>
+      </w:pPr>
+      <w:r>
+        <w:t>D:\Github</w:t>
+      </w:r>
+    </w:p>
+    <w:p>
+      <w:pPr>
+        <w:pStyle w:val="ListParagraph"/>
+        <w:spacing w:line="276" w:lineRule="auto"/>
+        <w:ind w:left="360"/>
+      </w:pPr>
+      <w:r>
+        <w:rPr>
+          <w:rFonts w:ascii="MS Gothic" w:eastAsia="MS Gothic" w:hAnsi="MS Gothic" w:cs="MS Gothic" w:hint="eastAsia"/>
+        </w:rPr>
+        <w:t>├</w:t>
+      </w:r>
+      <w:r>
+        <w:rPr>
+          <w:rFonts w:ascii="Calibri" w:hAnsi="Calibri" w:cs="Calibri"/>
+        </w:rPr>
+        <w:t>─</w:t>
+      </w:r>
+      <w:proofErr w:type="gramStart"/>
+      <w:r>
+        <w:rPr>
+          <w:rFonts w:ascii="Calibri" w:hAnsi="Calibri" w:cs="Calibri"/>
+        </w:rPr>
+        <w:t>─</w:t>
+      </w:r>
+      <w:r>
+        <w:t xml:space="preserve"> .git</w:t>
+      </w:r>
+      <w:proofErr w:type="gramEnd"/>
+    </w:p>
+    <w:p>
+      <w:pPr>
+        <w:pStyle w:val="ListParagraph"/>
+        <w:spacing w:line="276" w:lineRule="auto"/>
+        <w:ind w:left="360"/>
+      </w:pPr>
+      <w:r>
+        <w:rPr>
+          <w:rFonts w:ascii="MS Gothic" w:eastAsia="MS Gothic" w:hAnsi="MS Gothic" w:cs="MS Gothic" w:hint="eastAsia"/>
+        </w:rPr>
+        <w:t>├</w:t>
+      </w:r>
+      <w:r>
+        <w:rPr>
+          <w:rFonts w:ascii="Calibri" w:hAnsi="Calibri" w:cs="Calibri"/>
+        </w:rPr>
+        <w:t>─</w:t>
+      </w:r>
+      <w:proofErr w:type="gramStart"/>
+      <w:r>
+        <w:rPr>
+          <w:rFonts w:ascii="Calibri" w:hAnsi="Calibri" w:cs="Calibri"/>
+        </w:rPr>
+        <w:t>─</w:t>
+      </w:r>
+      <w:r>
+        <w:t xml:space="preserve"> .</w:t>
+      </w:r>
+      <w:proofErr w:type="spellStart"/>
+      <w:r>
+        <w:t>venv</w:t>
+      </w:r>
+      <w:proofErr w:type="spellEnd"/>
+      <w:proofErr w:type="gramEnd"/>
+    </w:p>
+    <w:p>
+      <w:pPr>
+        <w:pStyle w:val="ListParagraph"/>
+        <w:spacing w:line="276" w:lineRule="auto"/>
+        <w:ind w:left="360"/>
+      </w:pPr>
+      <w:r>
+        <w:rPr>
+          <w:rFonts w:ascii="MS Gothic" w:eastAsia="MS Gothic" w:hAnsi="MS Gothic" w:cs="MS Gothic" w:hint="eastAsia"/>
+        </w:rPr>
+        <w:t>├</w:t>
+      </w:r>
+      <w:r>
+        <w:rPr>
+          <w:rFonts w:ascii="Calibri" w:hAnsi="Calibri" w:cs="Calibri"/>
+        </w:rPr>
+        <w:t>─</w:t>
+      </w:r>
+      <w:proofErr w:type="gramStart"/>
+      <w:r>
+        <w:rPr>
+          <w:rFonts w:ascii="Calibri" w:hAnsi="Calibri" w:cs="Calibri"/>
+        </w:rPr>
+        <w:t>─</w:t>
+      </w:r>
+      <w:r>
+        <w:t xml:space="preserve"> .</w:t>
+      </w:r>
+      <w:proofErr w:type="spellStart"/>
+      <w:r>
+        <w:t>vscode</w:t>
+      </w:r>
+      <w:proofErr w:type="spellEnd"/>
+      <w:proofErr w:type="gramEnd"/>
+    </w:p>
+    <w:p>
+      <w:pPr>
+        <w:pStyle w:val="ListParagraph"/>
+        <w:spacing w:line="276" w:lineRule="auto"/>
+        <w:ind w:left="360"/>
+      </w:pPr>
+      <w:r>
+        <w:rPr>
+          <w:rFonts w:ascii="MS Gothic" w:eastAsia="MS Gothic" w:hAnsi="MS Gothic" w:cs="MS Gothic" w:hint="eastAsia"/>
+        </w:rPr>
+        <w:t>├</w:t>
+      </w:r>
+      <w:r>
+        <w:rPr>
+          <w:rFonts w:ascii="Calibri" w:hAnsi="Calibri" w:cs="Calibri"/>
+        </w:rPr>
+        <w:t>──</w:t>
+      </w:r>
+      <w:r>
+        <w:t xml:space="preserve"> config</w:t>
+      </w:r>
+    </w:p>
+    <w:p>
+      <w:pPr>
+        <w:pStyle w:val="ListParagraph"/>
+        <w:spacing w:line="276" w:lineRule="auto"/>
+        <w:ind w:left="360"/>
+      </w:pPr>
+      <w:r>
+        <w:rPr>
+          <w:rFonts w:ascii="MS Gothic" w:eastAsia="MS Gothic" w:hAnsi="MS Gothic" w:cs="MS Gothic" w:hint="eastAsia"/>
+        </w:rPr>
+        <w:t>├</w:t>
+      </w:r>
+      <w:r>
+        <w:rPr>
+          <w:rFonts w:ascii="Calibri" w:hAnsi="Calibri" w:cs="Calibri"/>
+        </w:rPr>
+        <w:t>──</w:t>
+      </w:r>
+      <w:r>
+        <w:t xml:space="preserve"> utils</w:t>
+      </w:r>
+    </w:p>
+    <w:p>
+      <w:pPr>
+        <w:pStyle w:val="ListParagraph"/>
+        <w:spacing w:line="276" w:lineRule="auto"/>
+        <w:ind w:left="360"/>
+      </w:pPr>
+      <w:r>
+        <w:rPr>
+          <w:rFonts w:ascii="MS Gothic" w:eastAsia="MS Gothic" w:hAnsi="MS Gothic" w:cs="MS Gothic" w:hint="eastAsia"/>
+        </w:rPr>
+        <w:t>├</w:t>
+      </w:r>
+      <w:r>
+        <w:rPr>
+          <w:rFonts w:ascii="Calibri" w:hAnsi="Calibri" w:cs="Calibri"/>
+        </w:rPr>
+        <w:t>──</w:t>
+      </w:r>
+      <w:r>
+        <w:t xml:space="preserve"> interview_questions.py</w:t>
+      </w:r>
+    </w:p>
+    <w:p>
+      <w:pPr>
+        <w:pStyle w:val="ListParagraph"/>
+        <w:spacing w:line="276" w:lineRule="auto"/>
+        <w:ind w:left="360"/>
+      </w:pPr>
+      <w:r>
+        <w:rPr>
+          <w:rFonts w:ascii="MS Gothic" w:eastAsia="MS Gothic" w:hAnsi="MS Gothic" w:cs="MS Gothic" w:hint="eastAsia"/>
+        </w:rPr>
+        <w:t>├</w:t>
+      </w:r>
+      <w:r>
+        <w:rPr>
+          <w:rFonts w:ascii="Calibri" w:hAnsi="Calibri" w:cs="Calibri"/>
+        </w:rPr>
+        <w:t>──</w:t>
+      </w:r>
+      <w:r>
+        <w:t xml:space="preserve"> README.md</w:t>
+      </w:r>
+    </w:p>
+    <w:p>
+      <w:pPr>
+        <w:pStyle w:val="ListParagraph"/>
+        <w:spacing w:line="276" w:lineRule="auto"/>
+        <w:ind w:left="360"/>
+      </w:pPr>
+      <w:r>
+        <w:t>└── vaibhav</w:t>
+      </w:r>
+    </w:p>
+    <w:p>
+      <w:pPr>
+        <w:pStyle w:val="ListParagraph"/>
+        <w:spacing w:line="276" w:lineRule="auto"/>
+        <w:ind w:left="360"/>
+      </w:pPr>
+      <w:r>
+        <w:t xml:space="preserve">    </w:t>
+      </w:r>
+      <w:r>
+        <w:rPr>
+          <w:rFonts w:ascii="MS Gothic" w:eastAsia="MS Gothic" w:hAnsi="MS Gothic" w:cs="MS Gothic" w:hint="eastAsia"/>
+        </w:rPr>
+        <w:t>├</w:t>
+      </w:r>
+      <w:r>
+        <w:rPr>
+          <w:rFonts w:ascii="Calibri" w:hAnsi="Calibri" w:cs="Calibri"/>
+        </w:rPr>
+        <w:t>──</w:t>
+      </w:r>
+      <w:r>
+        <w:t xml:space="preserve"> Scripts</w:t>
+      </w:r>
+    </w:p>
+    <w:p>
+      <w:pPr>
+        <w:pStyle w:val="ListParagraph"/>
+        <w:spacing w:line="276" w:lineRule="auto"/>
+        <w:ind w:left="360"/>
+      </w:pPr>
+      <w:r>
+        <w:t xml:space="preserve">    </w:t>
+      </w:r>
+      <w:r>
+        <w:rPr>
+          <w:rFonts w:ascii="MS Gothic" w:eastAsia="MS Gothic" w:hAnsi="MS Gothic" w:cs="MS Gothic" w:hint="eastAsia"/>
+        </w:rPr>
+        <w:t>├</w:t>
+      </w:r>
+      <w:r>
+        <w:rPr>
+          <w:rFonts w:ascii="Calibri" w:hAnsi="Calibri" w:cs="Calibri"/>
+        </w:rPr>
+        <w:t>──</w:t>
+      </w:r>
+      <w:r>
+        <w:t xml:space="preserve"> Lib</w:t>
+      </w:r>
+    </w:p>
+    <w:p>
+      <w:pPr>
+        <w:pStyle w:val="ListParagraph"/>
+        <w:spacing w:line="276" w:lineRule="auto"/>
+        <w:ind w:left="360"/>
+      </w:pPr>
+      <w:r>
+        <w:t xml:space="preserve">    </w:t>
+      </w:r>
+      <w:r>
+        <w:rPr>
+          <w:rFonts w:ascii="MS Gothic" w:eastAsia="MS Gothic" w:hAnsi="MS Gothic" w:cs="MS Gothic" w:hint="eastAsia"/>
+        </w:rPr>
+        <w:t>├</w:t>
+      </w:r>
+      <w:r>
+        <w:rPr>
+          <w:rFonts w:ascii="Calibri" w:hAnsi="Calibri" w:cs="Calibri"/>
+        </w:rPr>
+        <w:t>──</w:t>
+      </w:r>
+      <w:r>
+        <w:t xml:space="preserve"> Include</w:t>
+      </w:r>
+    </w:p>
+    <w:p>
+      <w:pPr>
+        <w:pStyle w:val="ListParagraph"/>
+        <w:spacing w:line="276" w:lineRule="auto"/>
+        <w:ind w:left="360"/>
+      </w:pPr>
+      <w:r>
+        <w:t xml:space="preserve">    └── </w:t>
+      </w:r>
+      <w:proofErr w:type="spellStart"/>
+      <w:r>
+        <w:t>pyvenv.cfg</w:t>
+      </w:r>
+      <w:proofErr w:type="spellEnd"/>
+    </w:p>
+    <w:p>
+      <w:pPr>
+        <w:pStyle w:val="ListParagraph"/>
+        <w:spacing w:line="276" w:lineRule="auto"/>
+        <w:ind w:left="360"/>
+        <w:rPr>
+          <w:b/>
+          <w:bCs/>
+        </w:rPr>
+      </w:pPr>
+    </w:p>
+    <w:p>
+      <w:pPr>
+        <w:pStyle w:val="ListParagraph"/>
+        <w:numPr>
+          <w:ilvl w:val="0"/>
+          <w:numId w:val="21"/>
+        </w:numPr>
+        <w:spacing w:line="276" w:lineRule="auto"/>
+        <w:rPr>
+          <w:b/>
+          <w:bCs/>
+        </w:rPr>
+      </w:pPr>
+      <w:r>
+        <w:rPr>
+          <w:b/>
+          <w:bCs/>
+        </w:rPr>
+        <w:t>How to Identify the Git Repository Root</w:t>
+      </w:r>
+    </w:p>
+    <w:p>
+      <w:pPr>
+        <w:pStyle w:val="ListParagraph"/>
+        <w:spacing w:after="120" w:line="360" w:lineRule="auto"/>
+        <w:ind w:left="357"/>
+      </w:pPr>
+      <w:r>
+        <w:rPr>
+          <w:highlight w:val="lightGray"/>
+        </w:rPr>
+        <w:t>git rev-parse --show-</w:t>
+      </w:r>
+      <w:proofErr w:type="spellStart"/>
+      <w:r>
+        <w:rPr>
+          <w:highlight w:val="lightGray"/>
+        </w:rPr>
+        <w:t>toplevel</w:t>
+      </w:r>
+      <w:proofErr w:type="spellEnd"/>
+    </w:p>
+    <w:p>
+      <w:pPr>
+        <w:pStyle w:val="ListParagraph"/>
+        <w:spacing w:before="120" w:line="276" w:lineRule="auto"/>
+        <w:ind w:left="357"/>
+        <w:rPr>
+          <w:b/>
+          <w:bCs/>
+        </w:rPr>
+      </w:pPr>
+      <w:r>
+        <w:rPr>
+          <w:b/>
+          <w:bCs/>
+        </w:rPr>
+        <w:t>Example output:</w:t>
+      </w:r>
+    </w:p>
+    <w:p>
+      <w:pPr>
+        <w:pStyle w:val="ListParagraph"/>
+        <w:spacing w:line="276" w:lineRule="auto"/>
+        <w:ind w:left="360"/>
+      </w:pPr>
+      <w:r>
+        <w:t>D:\Github</w:t>
+      </w:r>
+    </w:p>
+    <w:p>
+      <w:pPr>
+        <w:pStyle w:val="ListParagraph"/>
+        <w:spacing w:line="276" w:lineRule="auto"/>
+        <w:ind w:left="360"/>
+      </w:pPr>
+      <w:r>
+        <w:rPr>
+          <w:noProof/>
+        </w:rPr>
+        <w:drawing>
+          <wp:inline distT="0" distB="0" distL="0" distR="0" wp14:anchorId="1F461000" wp14:editId="5DE0936F">
+            <wp:extent cx="3787468" cy="510584"/>
+            <wp:effectExtent l="38100" t="38100" r="99060" b="99060"/>
+            <wp:docPr id="632936636" name="Picture 1"/>
+            <wp:cNvGraphicFramePr>
+              <a:graphicFrameLocks xmlns:a="http://schemas.openxmlformats.org/drawingml/2006/main" noChangeAspect="1"/>
+            </wp:cNvGraphicFramePr>
+            <a:graphic xmlns:a="http://schemas.openxmlformats.org/drawingml/2006/main">
+              <a:graphicData uri="http://schemas.openxmlformats.org/drawingml/2006/picture">
+                <pic:pic xmlns:pic="http://schemas.openxmlformats.org/drawingml/2006/picture">
+                  <pic:nvPicPr>
+                    <pic:cNvPr id="632936636" name=""/>
+                    <pic:cNvPicPr/>
+                  </pic:nvPicPr>
+                  <pic:blipFill>
+                    <a:blip r:embed="rId10">
+                      <a:extLst>
+                        <a:ext uri="{28A0092B-C50C-407E-A947-70E740481C1C}">
+                          <a14:useLocalDpi xmlns:a14="http://schemas.microsoft.com/office/drawing/2010/main" val="0"/>
+                        </a:ext>
+                      </a:extLst>
+                    </a:blip>
+                    <a:stretch>
+                      <a:fillRect/>
+                    </a:stretch>
+                  </pic:blipFill>
+                  <pic:spPr>
+                    <a:xfrm>
+                      <a:off x="0" y="0"/>
+                      <a:ext cx="3787468" cy="510584"/>
+                    </a:xfrm>
+                    <a:prstGeom prst="rect">
+                      <a:avLst/>
+                    </a:prstGeom>
+                    <a:ln w="3175" cap="sq">
+                      <a:solidFill>
+                        <a:srgbClr val="000000"/>
+                      </a:solidFill>
+                      <a:prstDash val="solid"/>
+                      <a:miter lim="800000"/>
+                    </a:ln>
+                    <a:effectLst>
+                      <a:outerShdw blurRad="50800" dist="38100" dir="2700000" algn="tl" rotWithShape="0">
+                        <a:srgbClr val="000000">
+                          <a:alpha val="43000"/>
+                        </a:srgbClr>
+                      </a:outerShdw>
+                    </a:effectLst>
+                  </pic:spPr>
+                </pic:pic>
+              </a:graphicData>
+            </a:graphic>
+          </wp:inline>
+        </w:drawing>
+      </w:r>
+    </w:p>
+    <w:p>
+      <w:pPr>
+        <w:pStyle w:val="ListParagraph"/>
+        <w:spacing w:line="276" w:lineRule="auto"/>
+        <w:ind w:left="360"/>
+        <w:rPr>
+          <w:highlight w:val="cyan"/>
+        </w:rPr>
+      </w:pPr>
+      <w:r>
+        <w:rPr>
+          <w:highlight w:val="cyan"/>
+        </w:rPr>
+        <w:lastRenderedPageBreak/>
+        <w:t>This is the actual Git repository root.</w:t>
+      </w:r>
+    </w:p>
+    <w:p>
+      <w:pPr>
+        <w:pStyle w:val="ListParagraph"/>
+        <w:spacing w:line="276" w:lineRule="auto"/>
+        <w:ind w:left="360"/>
+      </w:pPr>
+      <w:r>
+        <w:rPr>
+          <w:highlight w:val="cyan"/>
+        </w:rPr>
+        <w:t xml:space="preserve">The folder </w:t>
+      </w:r>
+      <w:proofErr w:type="gramStart"/>
+      <w:r>
+        <w:rPr>
+          <w:highlight w:val="cyan"/>
+        </w:rPr>
+        <w:t>containing .git</w:t>
+      </w:r>
+      <w:proofErr w:type="gramEnd"/>
+      <w:r>
+        <w:rPr>
+          <w:highlight w:val="cyan"/>
+        </w:rPr>
+        <w:t xml:space="preserve"> is always the repository root.</w:t>
+      </w:r>
+    </w:p>
+    <w:p>
+      <w:pPr>
+        <w:pStyle w:val="ListParagraph"/>
+        <w:spacing w:line="276" w:lineRule="auto"/>
+        <w:ind w:left="360"/>
+        <w:rPr>
+          <w:b/>
+          <w:bCs/>
+        </w:rPr>
+      </w:pPr>
+    </w:p>
+    <w:p>
+      <w:pPr>
+        <w:pStyle w:val="ListParagraph"/>
+        <w:numPr>
+          <w:ilvl w:val="0"/>
+          <w:numId w:val="21"/>
+        </w:numPr>
+        <w:spacing w:line="276" w:lineRule="auto"/>
+        <w:rPr>
+          <w:b/>
+          <w:bCs/>
+        </w:rPr>
+      </w:pPr>
+      <w:r>
+        <w:rPr>
+          <w:b/>
+          <w:bCs/>
+        </w:rPr>
+        <w:t>How to Identify a Python Virtual Environment</w:t>
+      </w:r>
+    </w:p>
+    <w:p>
+      <w:pPr>
+        <w:pStyle w:val="ListParagraph"/>
+        <w:spacing w:line="276" w:lineRule="auto"/>
+        <w:ind w:left="360"/>
+      </w:pPr>
+      <w:r>
+        <w:t>A Python virtual environment typically contains:</w:t>
+      </w:r>
+    </w:p>
+    <w:p>
+      <w:pPr>
+        <w:pStyle w:val="ListParagraph"/>
+        <w:spacing w:line="276" w:lineRule="auto"/>
+        <w:ind w:left="360"/>
+      </w:pPr>
+      <w:r>
+        <w:t>Scripts</w:t>
+      </w:r>
+    </w:p>
+    <w:p>
+      <w:pPr>
+        <w:pStyle w:val="ListParagraph"/>
+        <w:spacing w:line="276" w:lineRule="auto"/>
+        <w:ind w:left="360"/>
+      </w:pPr>
+      <w:r>
+        <w:t>Lib</w:t>
+      </w:r>
+    </w:p>
+    <w:p>
+      <w:pPr>
+        <w:pStyle w:val="ListParagraph"/>
+        <w:spacing w:line="276" w:lineRule="auto"/>
+        <w:ind w:left="360"/>
+      </w:pPr>
+      <w:r>
+        <w:t>Include</w:t>
+      </w:r>
+    </w:p>
+    <w:p>
+      <w:pPr>
+        <w:pStyle w:val="ListParagraph"/>
+        <w:spacing w:line="276" w:lineRule="auto"/>
+        <w:ind w:left="360"/>
+      </w:pPr>
+      <w:proofErr w:type="spellStart"/>
+      <w:r>
+        <w:t>pyvenv.cfg</w:t>
+      </w:r>
+      <w:proofErr w:type="spellEnd"/>
+    </w:p>
+    <w:p>
+      <w:pPr>
+        <w:pStyle w:val="ListParagraph"/>
+        <w:spacing w:line="276" w:lineRule="auto"/>
+        <w:ind w:left="360"/>
+        <w:rPr>
+          <w:b/>
+          <w:bCs/>
+        </w:rPr>
+      </w:pPr>
+      <w:r>
+        <w:rPr>
+          <w:b/>
+          <w:bCs/>
+        </w:rPr>
+        <w:t>Example:</w:t>
+      </w:r>
+    </w:p>
+    <w:p>
+      <w:pPr>
+        <w:pStyle w:val="ListParagraph"/>
+        <w:spacing w:line="276" w:lineRule="auto"/>
+        <w:ind w:left="360"/>
+      </w:pPr>
+      <w:r>
+        <w:t>D:\Github\vaibhav</w:t>
+      </w:r>
+    </w:p>
+    <w:p>
+      <w:pPr>
+        <w:pStyle w:val="ListParagraph"/>
+        <w:spacing w:line="276" w:lineRule="auto"/>
+        <w:ind w:left="360"/>
+      </w:pPr>
+      <w:r>
+        <w:rPr>
+          <w:rFonts w:ascii="MS Gothic" w:eastAsia="MS Gothic" w:hAnsi="MS Gothic" w:cs="MS Gothic" w:hint="eastAsia"/>
+        </w:rPr>
+        <w:t>├</w:t>
+      </w:r>
+      <w:r>
+        <w:rPr>
+          <w:rFonts w:ascii="Calibri" w:hAnsi="Calibri" w:cs="Calibri"/>
+        </w:rPr>
+        <w:t>──</w:t>
+      </w:r>
+      <w:r>
+        <w:t xml:space="preserve"> Scripts</w:t>
+      </w:r>
+    </w:p>
+    <w:p>
+      <w:pPr>
+        <w:pStyle w:val="ListParagraph"/>
+        <w:spacing w:line="276" w:lineRule="auto"/>
+        <w:ind w:left="360"/>
+      </w:pPr>
+      <w:r>
+        <w:rPr>
+          <w:rFonts w:ascii="MS Gothic" w:eastAsia="MS Gothic" w:hAnsi="MS Gothic" w:cs="MS Gothic" w:hint="eastAsia"/>
+        </w:rPr>
+        <w:t>├</w:t>
+      </w:r>
+      <w:r>
+        <w:rPr>
+          <w:rFonts w:ascii="Calibri" w:hAnsi="Calibri" w:cs="Calibri"/>
+        </w:rPr>
+        <w:t>──</w:t>
+      </w:r>
+      <w:r>
+        <w:t xml:space="preserve"> Lib</w:t>
+      </w:r>
+    </w:p>
+    <w:p>
+      <w:pPr>
+        <w:pStyle w:val="ListParagraph"/>
+        <w:spacing w:line="276" w:lineRule="auto"/>
+        <w:ind w:left="360"/>
+      </w:pPr>
+      <w:r>
+        <w:rPr>
+          <w:rFonts w:ascii="MS Gothic" w:eastAsia="MS Gothic" w:hAnsi="MS Gothic" w:cs="MS Gothic" w:hint="eastAsia"/>
+        </w:rPr>
+        <w:t>├</w:t>
+      </w:r>
+      <w:r>
+        <w:rPr>
+          <w:rFonts w:ascii="Calibri" w:hAnsi="Calibri" w:cs="Calibri"/>
+        </w:rPr>
+        <w:t>──</w:t>
+      </w:r>
+      <w:r>
+        <w:t xml:space="preserve"> Include</w:t>
+      </w:r>
+    </w:p>
+    <w:p>
+      <w:pPr>
+        <w:pStyle w:val="ListParagraph"/>
+        <w:spacing w:line="276" w:lineRule="auto"/>
+        <w:ind w:left="360"/>
+      </w:pPr>
+      <w:r>
+        <w:t xml:space="preserve">└── </w:t>
+      </w:r>
+      <w:proofErr w:type="spellStart"/>
+      <w:r>
+        <w:t>pyvenv.cfg</w:t>
+      </w:r>
+      <w:proofErr w:type="spellEnd"/>
+    </w:p>
+    <w:p>
+      <w:pPr>
+        <w:pStyle w:val="ListParagraph"/>
+        <w:spacing w:line="276" w:lineRule="auto"/>
+        <w:ind w:left="357"/>
+        <w:contextualSpacing w:val="0"/>
+      </w:pPr>
+      <w:r>
+        <w:rPr>
+          <w:highlight w:val="cyan"/>
+        </w:rPr>
+        <w:t xml:space="preserve">This folder is NOT a Git repository unless it also contains </w:t>
+      </w:r>
+      <w:proofErr w:type="gramStart"/>
+      <w:r>
+        <w:rPr>
+          <w:highlight w:val="cyan"/>
+        </w:rPr>
+        <w:t>a .git</w:t>
+      </w:r>
+      <w:proofErr w:type="gramEnd"/>
+      <w:r>
+        <w:rPr>
+          <w:highlight w:val="cyan"/>
+        </w:rPr>
+        <w:t xml:space="preserve"> folder.</w:t>
+      </w:r>
+    </w:p>
+    <w:p>
+      <w:pPr>
+        <w:pStyle w:val="ListParagraph"/>
+        <w:spacing w:line="276" w:lineRule="auto"/>
+        <w:ind w:left="360"/>
+        <w:rPr>
+          <w:b/>
+          <w:bCs/>
+        </w:rPr>
+      </w:pPr>
+      <w:r>
+        <w:rPr>
+          <w:b/>
+          <w:bCs/>
+        </w:rPr>
+        <w:t>Key Concept</w:t>
+      </w:r>
+    </w:p>
+    <w:p>
+      <w:pPr>
+        <w:pStyle w:val="ListParagraph"/>
+        <w:spacing w:line="276" w:lineRule="auto"/>
+        <w:ind w:left="360"/>
+      </w:pPr>
+      <w:r>
+        <w:t>Git cares about</w:t>
+      </w:r>
+      <w:proofErr w:type="gramStart"/>
+      <w:r>
+        <w:t>:</w:t>
+      </w:r>
+      <w:r>
+        <w:t xml:space="preserve"> </w:t>
+      </w:r>
+      <w:r>
+        <w:rPr>
+          <w:highlight w:val="lightGray"/>
+        </w:rPr>
+        <w:t>.git</w:t>
+      </w:r>
+      <w:proofErr w:type="gramEnd"/>
+    </w:p>
+    <w:p>
+      <w:pPr>
+        <w:pStyle w:val="ListParagraph"/>
+        <w:spacing w:line="360" w:lineRule="auto"/>
+        <w:ind w:left="357"/>
+      </w:pPr>
+      <w:r>
+        <w:t>Python cares about:</w:t>
+      </w:r>
+      <w:r>
+        <w:t xml:space="preserve"> </w:t>
+      </w:r>
+      <w:r>
+        <w:rPr>
+          <w:highlight w:val="lightGray"/>
+        </w:rPr>
+        <w:t>Scripts\python.exe</w:t>
+      </w:r>
+    </w:p>
+    <w:p>
+      <w:pPr>
+        <w:pStyle w:val="ListParagraph"/>
+        <w:spacing w:line="360" w:lineRule="auto"/>
+        <w:ind w:left="357"/>
+      </w:pPr>
+      <w:r>
+        <w:t>They serve different purposes.</w:t>
+      </w:r>
+    </w:p>
+    <w:tbl>
+      <w:tblPr>
+        <w:tblW w:w="0" w:type="auto"/>
+        <w:tblCellMar>
+          <w:top w:w="15" w:type="dxa"/>
+          <w:left w:w="15" w:type="dxa"/>
+          <w:bottom w:w="15" w:type="dxa"/>
+          <w:right w:w="15" w:type="dxa"/>
+        </w:tblCellMar>
+        <w:tblLook w:val="04A0" w:firstRow="1" w:lastRow="0" w:firstColumn="1" w:lastColumn="0" w:noHBand="0" w:noVBand="1"/>
+      </w:tblPr>
+      <w:tblGrid>
+        <w:gridCol w:w="2689"/>
+        <w:gridCol w:w="5244"/>
+      </w:tblGrid>
+      <w:tr>
+        <w:trPr>
+          <w:trHeight w:val="170"/>
+          <w:tblHeader/>
+        </w:trPr>
+        <w:tc>
+          <w:tcPr>
+            <w:tcW w:w="2689" w:type="dxa"/>
+            <w:tcBorders>
+              <w:top w:val="single" w:sz="4" w:space="0" w:color="auto"/>
+              <w:left w:val="single" w:sz="4" w:space="0" w:color="auto"/>
+              <w:bottom w:val="single" w:sz="4" w:space="0" w:color="auto"/>
+              <w:right w:val="single" w:sz="4" w:space="0" w:color="auto"/>
+            </w:tcBorders>
+            <w:vAlign w:val="center"/>
+            <w:hideMark/>
+          </w:tcPr>
+          <w:p>
+            <w:pPr>
+              <w:pStyle w:val="ListParagraph"/>
+              <w:spacing w:after="0" w:line="276" w:lineRule="auto"/>
+              <w:ind w:left="360"/>
+              <w:jc w:val="center"/>
+              <w:rPr>
+                <w:rFonts w:ascii="Arial" w:hAnsi="Arial" w:cs="Arial"/>
+                <w:b/>
+                <w:bCs/>
+                <w:sz w:val="20"/>
+                <w:szCs w:val="20"/>
+              </w:rPr>
+            </w:pPr>
+            <w:r>
+              <w:rPr>
+                <w:rFonts w:ascii="Arial" w:hAnsi="Arial" w:cs="Arial"/>
+                <w:b/>
+                <w:bCs/>
+                <w:sz w:val="20"/>
+                <w:szCs w:val="20"/>
+              </w:rPr>
+              <w:t>Component</w:t>
+            </w:r>
+          </w:p>
+        </w:tc>
+        <w:tc>
+          <w:tcPr>
+            <w:tcW w:w="5244" w:type="dxa"/>
+            <w:tcBorders>
+              <w:top w:val="single" w:sz="4" w:space="0" w:color="auto"/>
+              <w:left w:val="single" w:sz="4" w:space="0" w:color="auto"/>
+              <w:bottom w:val="single" w:sz="4" w:space="0" w:color="auto"/>
+              <w:right w:val="single" w:sz="4" w:space="0" w:color="auto"/>
+            </w:tcBorders>
+            <w:vAlign w:val="center"/>
+            <w:hideMark/>
+          </w:tcPr>
+          <w:p>
+            <w:pPr>
+              <w:pStyle w:val="ListParagraph"/>
+              <w:spacing w:after="0" w:line="276" w:lineRule="auto"/>
+              <w:ind w:left="360"/>
+              <w:jc w:val="center"/>
+              <w:rPr>
+                <w:rFonts w:ascii="Arial" w:hAnsi="Arial" w:cs="Arial"/>
+                <w:b/>
+                <w:bCs/>
+                <w:sz w:val="20"/>
+                <w:szCs w:val="20"/>
+              </w:rPr>
+            </w:pPr>
+            <w:r>
+              <w:rPr>
+                <w:rFonts w:ascii="Arial" w:hAnsi="Arial" w:cs="Arial"/>
+                <w:b/>
+                <w:bCs/>
+                <w:sz w:val="20"/>
+                <w:szCs w:val="20"/>
+              </w:rPr>
+              <w:t>Purpose</w:t>
+            </w:r>
+          </w:p>
+        </w:tc>
+      </w:tr>
+      <w:tr>
+        <w:trPr>
+          <w:trHeight w:val="170"/>
+        </w:trPr>
+        <w:tc>
+          <w:tcPr>
+            <w:tcW w:w="2689" w:type="dxa"/>
+            <w:tcBorders>
+              <w:top w:val="single" w:sz="4" w:space="0" w:color="auto"/>
+              <w:left w:val="single" w:sz="4" w:space="0" w:color="auto"/>
+              <w:bottom w:val="single" w:sz="4" w:space="0" w:color="auto"/>
+              <w:right w:val="single" w:sz="4" w:space="0" w:color="auto"/>
+            </w:tcBorders>
+            <w:vAlign w:val="center"/>
+            <w:hideMark/>
+          </w:tcPr>
+          <w:p>
+            <w:pPr>
+              <w:pStyle w:val="ListParagraph"/>
+              <w:spacing w:after="0" w:line="276" w:lineRule="auto"/>
+              <w:ind w:left="170"/>
+              <w:rPr>
+                <w:rFonts w:ascii="Arial" w:hAnsi="Arial" w:cs="Arial"/>
+                <w:sz w:val="20"/>
+                <w:szCs w:val="20"/>
+              </w:rPr>
+            </w:pPr>
+            <w:proofErr w:type="gramStart"/>
+            <w:r>
+              <w:rPr>
+                <w:rFonts w:ascii="Arial" w:hAnsi="Arial" w:cs="Arial"/>
+                <w:sz w:val="20"/>
+                <w:szCs w:val="20"/>
+              </w:rPr>
+              <w:t>.git</w:t>
+            </w:r>
+            <w:proofErr w:type="gramEnd"/>
+          </w:p>
+        </w:tc>
+        <w:tc>
+          <w:tcPr>
+            <w:tcW w:w="5244" w:type="dxa"/>
+            <w:tcBorders>
+              <w:top w:val="single" w:sz="4" w:space="0" w:color="auto"/>
+              <w:left w:val="single" w:sz="4" w:space="0" w:color="auto"/>
+              <w:bottom w:val="single" w:sz="4" w:space="0" w:color="auto"/>
+              <w:right w:val="single" w:sz="4" w:space="0" w:color="auto"/>
+            </w:tcBorders>
+            <w:vAlign w:val="center"/>
+            <w:hideMark/>
+          </w:tcPr>
+          <w:p>
+            <w:pPr>
+              <w:pStyle w:val="ListParagraph"/>
+              <w:spacing w:after="0" w:line="276" w:lineRule="auto"/>
+              <w:ind w:left="170"/>
+              <w:rPr>
+                <w:rFonts w:ascii="Arial" w:hAnsi="Arial" w:cs="Arial"/>
+                <w:sz w:val="20"/>
+                <w:szCs w:val="20"/>
+              </w:rPr>
+            </w:pPr>
+            <w:r>
+              <w:rPr>
+                <w:rFonts w:ascii="Arial" w:hAnsi="Arial" w:cs="Arial"/>
+                <w:sz w:val="20"/>
+                <w:szCs w:val="20"/>
+              </w:rPr>
+              <w:t>Stores Git history, commits, branches, remotes</w:t>
+            </w:r>
+          </w:p>
+        </w:tc>
+      </w:tr>
+      <w:tr>
+        <w:trPr>
+          <w:trHeight w:val="170"/>
+        </w:trPr>
+        <w:tc>
+          <w:tcPr>
+            <w:tcW w:w="2689" w:type="dxa"/>
+            <w:tcBorders>
+              <w:top w:val="single" w:sz="4" w:space="0" w:color="auto"/>
+              <w:left w:val="single" w:sz="4" w:space="0" w:color="auto"/>
+              <w:bottom w:val="single" w:sz="4" w:space="0" w:color="auto"/>
+              <w:right w:val="single" w:sz="4" w:space="0" w:color="auto"/>
+            </w:tcBorders>
+            <w:vAlign w:val="center"/>
+            <w:hideMark/>
+          </w:tcPr>
+          <w:p>
+            <w:pPr>
+              <w:pStyle w:val="ListParagraph"/>
+              <w:spacing w:after="0" w:line="276" w:lineRule="auto"/>
+              <w:ind w:left="170"/>
+              <w:rPr>
+                <w:rFonts w:ascii="Arial" w:hAnsi="Arial" w:cs="Arial"/>
+                <w:sz w:val="20"/>
+                <w:szCs w:val="20"/>
+              </w:rPr>
+            </w:pPr>
+            <w:r>
+              <w:rPr>
+                <w:rFonts w:ascii="Arial" w:hAnsi="Arial" w:cs="Arial"/>
+                <w:sz w:val="20"/>
+                <w:szCs w:val="20"/>
+              </w:rPr>
+              <w:t>Virtual Environment (</w:t>
+            </w:r>
+            <w:proofErr w:type="spellStart"/>
+            <w:r>
+              <w:rPr>
+                <w:rFonts w:ascii="Arial" w:hAnsi="Arial" w:cs="Arial"/>
+                <w:sz w:val="20"/>
+                <w:szCs w:val="20"/>
+              </w:rPr>
+              <w:t>venv</w:t>
+            </w:r>
+            <w:proofErr w:type="spellEnd"/>
+            <w:r>
+              <w:rPr>
+                <w:rFonts w:ascii="Arial" w:hAnsi="Arial" w:cs="Arial"/>
+                <w:sz w:val="20"/>
+                <w:szCs w:val="20"/>
+              </w:rPr>
+              <w:t>)</w:t>
+            </w:r>
+          </w:p>
+        </w:tc>
+        <w:tc>
+          <w:tcPr>
+            <w:tcW w:w="5244" w:type="dxa"/>
+            <w:tcBorders>
+              <w:top w:val="single" w:sz="4" w:space="0" w:color="auto"/>
+              <w:left w:val="single" w:sz="4" w:space="0" w:color="auto"/>
+              <w:bottom w:val="single" w:sz="4" w:space="0" w:color="auto"/>
+              <w:right w:val="single" w:sz="4" w:space="0" w:color="auto"/>
+            </w:tcBorders>
+            <w:vAlign w:val="center"/>
+            <w:hideMark/>
+          </w:tcPr>
+          <w:p>
+            <w:pPr>
+              <w:pStyle w:val="ListParagraph"/>
+              <w:spacing w:after="0" w:line="276" w:lineRule="auto"/>
+              <w:ind w:left="170"/>
+              <w:rPr>
+                <w:rFonts w:ascii="Arial" w:hAnsi="Arial" w:cs="Arial"/>
+                <w:sz w:val="20"/>
+                <w:szCs w:val="20"/>
+              </w:rPr>
+            </w:pPr>
+            <w:r>
+              <w:rPr>
+                <w:rFonts w:ascii="Arial" w:hAnsi="Arial" w:cs="Arial"/>
+                <w:sz w:val="20"/>
+                <w:szCs w:val="20"/>
+              </w:rPr>
+              <w:t>Stores Python interpreter and installed packages</w:t>
+            </w:r>
+          </w:p>
+        </w:tc>
+      </w:tr>
+      <w:tr>
+        <w:trPr>
+          <w:trHeight w:val="170"/>
+        </w:trPr>
+        <w:tc>
+          <w:tcPr>
+            <w:tcW w:w="2689" w:type="dxa"/>
+            <w:tcBorders>
+              <w:top w:val="single" w:sz="4" w:space="0" w:color="auto"/>
+              <w:left w:val="single" w:sz="4" w:space="0" w:color="auto"/>
+              <w:bottom w:val="single" w:sz="4" w:space="0" w:color="auto"/>
+              <w:right w:val="single" w:sz="4" w:space="0" w:color="auto"/>
+            </w:tcBorders>
+            <w:vAlign w:val="center"/>
+            <w:hideMark/>
+          </w:tcPr>
+          <w:p>
+            <w:pPr>
+              <w:pStyle w:val="ListParagraph"/>
+              <w:spacing w:after="0" w:line="276" w:lineRule="auto"/>
+              <w:ind w:left="170"/>
+              <w:rPr>
+                <w:rFonts w:ascii="Arial" w:hAnsi="Arial" w:cs="Arial"/>
+                <w:sz w:val="20"/>
+                <w:szCs w:val="20"/>
+              </w:rPr>
+            </w:pPr>
+            <w:r>
+              <w:rPr>
+                <w:rFonts w:ascii="Arial" w:hAnsi="Arial" w:cs="Arial"/>
+                <w:sz w:val="20"/>
+                <w:szCs w:val="20"/>
+              </w:rPr>
+              <w:t>Repository Root</w:t>
+            </w:r>
+          </w:p>
+        </w:tc>
+        <w:tc>
+          <w:tcPr>
+            <w:tcW w:w="5244" w:type="dxa"/>
+            <w:tcBorders>
+              <w:top w:val="single" w:sz="4" w:space="0" w:color="auto"/>
+              <w:left w:val="single" w:sz="4" w:space="0" w:color="auto"/>
+              <w:bottom w:val="single" w:sz="4" w:space="0" w:color="auto"/>
+              <w:right w:val="single" w:sz="4" w:space="0" w:color="auto"/>
+            </w:tcBorders>
+            <w:vAlign w:val="center"/>
+            <w:hideMark/>
+          </w:tcPr>
+          <w:p>
+            <w:pPr>
+              <w:pStyle w:val="ListParagraph"/>
+              <w:spacing w:after="0" w:line="276" w:lineRule="auto"/>
+              <w:ind w:left="170"/>
+              <w:rPr>
+                <w:rFonts w:ascii="Arial" w:hAnsi="Arial" w:cs="Arial"/>
+                <w:sz w:val="20"/>
+                <w:szCs w:val="20"/>
+              </w:rPr>
+            </w:pPr>
+            <w:r>
+              <w:rPr>
+                <w:rFonts w:ascii="Arial" w:hAnsi="Arial" w:cs="Arial"/>
+                <w:sz w:val="20"/>
+                <w:szCs w:val="20"/>
+              </w:rPr>
+              <w:t>Where Git tracks files</w:t>
+            </w:r>
+          </w:p>
+        </w:tc>
+      </w:tr>
+      <w:tr>
+        <w:trPr>
+          <w:trHeight w:val="170"/>
+        </w:trPr>
+        <w:tc>
+          <w:tcPr>
+            <w:tcW w:w="2689" w:type="dxa"/>
+            <w:tcBorders>
+              <w:top w:val="single" w:sz="4" w:space="0" w:color="auto"/>
+              <w:left w:val="single" w:sz="4" w:space="0" w:color="auto"/>
+              <w:bottom w:val="single" w:sz="4" w:space="0" w:color="auto"/>
+              <w:right w:val="single" w:sz="4" w:space="0" w:color="auto"/>
+            </w:tcBorders>
+            <w:vAlign w:val="center"/>
+            <w:hideMark/>
+          </w:tcPr>
+          <w:p>
+            <w:pPr>
+              <w:pStyle w:val="ListParagraph"/>
+              <w:spacing w:after="120" w:line="276" w:lineRule="auto"/>
+              <w:ind w:left="170"/>
+              <w:rPr>
+                <w:rFonts w:ascii="Arial" w:hAnsi="Arial" w:cs="Arial"/>
+                <w:sz w:val="20"/>
+                <w:szCs w:val="20"/>
+              </w:rPr>
+            </w:pPr>
+            <w:r>
+              <w:rPr>
+                <w:rFonts w:ascii="Arial" w:hAnsi="Arial" w:cs="Arial"/>
+                <w:sz w:val="20"/>
+                <w:szCs w:val="20"/>
+              </w:rPr>
+              <w:t>Virtual Environment Folder</w:t>
+            </w:r>
+          </w:p>
+        </w:tc>
+        <w:tc>
+          <w:tcPr>
+            <w:tcW w:w="5244" w:type="dxa"/>
+            <w:tcBorders>
+              <w:top w:val="single" w:sz="4" w:space="0" w:color="auto"/>
+              <w:left w:val="single" w:sz="4" w:space="0" w:color="auto"/>
+              <w:bottom w:val="single" w:sz="4" w:space="0" w:color="auto"/>
+              <w:right w:val="single" w:sz="4" w:space="0" w:color="auto"/>
+            </w:tcBorders>
+            <w:vAlign w:val="center"/>
+            <w:hideMark/>
+          </w:tcPr>
+          <w:p>
+            <w:pPr>
+              <w:pStyle w:val="ListParagraph"/>
+              <w:spacing w:after="0" w:line="276" w:lineRule="auto"/>
+              <w:ind w:left="170"/>
+              <w:rPr>
+                <w:rFonts w:ascii="Arial" w:hAnsi="Arial" w:cs="Arial"/>
+                <w:sz w:val="20"/>
+                <w:szCs w:val="20"/>
+              </w:rPr>
+            </w:pPr>
+            <w:r>
+              <w:rPr>
+                <w:rFonts w:ascii="Arial" w:hAnsi="Arial" w:cs="Arial"/>
+                <w:sz w:val="20"/>
+                <w:szCs w:val="20"/>
+              </w:rPr>
+              <w:t>Where Python packages live</w:t>
+            </w:r>
+          </w:p>
+        </w:tc>
+      </w:tr>
+    </w:tbl>
+    <w:p>
+      <w:pPr>
+        <w:pStyle w:val="ListParagraph"/>
+        <w:spacing w:before="120" w:line="276" w:lineRule="auto"/>
+        <w:ind w:left="360"/>
+        <w:rPr>
+          <w:b/>
+          <w:bCs/>
+        </w:rPr>
+      </w:pPr>
+      <w:r>
+        <w:rPr>
+          <w:b/>
+          <w:bCs/>
+        </w:rPr>
+        <w:t>Important Commands</w:t>
+      </w:r>
+    </w:p>
+    <w:p>
+      <w:pPr>
+        <w:pStyle w:val="ListParagraph"/>
+        <w:spacing w:line="276" w:lineRule="auto"/>
+        <w:ind w:left="360"/>
+      </w:pPr>
+      <w:r>
+        <w:t>Find repository root:</w:t>
+      </w:r>
+      <w:r>
+        <w:t xml:space="preserve"> </w:t>
+      </w:r>
+      <w:r>
+        <w:rPr>
+          <w:highlight w:val="lightGray"/>
+        </w:rPr>
+        <w:t>git rev-parse --show-</w:t>
+      </w:r>
+      <w:proofErr w:type="spellStart"/>
+      <w:r>
+        <w:rPr>
+          <w:highlight w:val="lightGray"/>
+        </w:rPr>
+        <w:t>toplevel</w:t>
+      </w:r>
+      <w:proofErr w:type="spellEnd"/>
+    </w:p>
+    <w:p>
+      <w:pPr>
+        <w:pStyle w:val="ListParagraph"/>
+        <w:spacing w:line="276" w:lineRule="auto"/>
+        <w:ind w:left="360"/>
+      </w:pPr>
+      <w:r>
+        <w:t>Show current Git status:</w:t>
+      </w:r>
+      <w:r>
+        <w:t xml:space="preserve"> </w:t>
+      </w:r>
+      <w:r>
+        <w:rPr>
+          <w:highlight w:val="lightGray"/>
+        </w:rPr>
+        <w:t>git status</w:t>
+      </w:r>
+    </w:p>
+    <w:p>
+      <w:pPr>
+        <w:pStyle w:val="ListParagraph"/>
+        <w:spacing w:line="276" w:lineRule="auto"/>
+        <w:ind w:left="360"/>
+      </w:pPr>
+      <w:r>
+        <w:t>Find active Python interpreter:</w:t>
+      </w:r>
+      <w:r>
+        <w:t xml:space="preserve"> </w:t>
+      </w:r>
+      <w:proofErr w:type="gramStart"/>
+      <w:r>
+        <w:rPr>
+          <w:highlight w:val="lightGray"/>
+        </w:rPr>
+        <w:t>where</w:t>
+      </w:r>
+      <w:proofErr w:type="gramEnd"/>
+      <w:r>
+        <w:rPr>
+          <w:highlight w:val="lightGray"/>
+        </w:rPr>
+        <w:t xml:space="preserve"> python</w:t>
+      </w:r>
+    </w:p>
+    <w:p>
+      <w:pPr>
+        <w:pStyle w:val="ListParagraph"/>
+        <w:spacing w:line="360" w:lineRule="auto"/>
+        <w:ind w:left="357"/>
+      </w:pPr>
+      <w:r>
+        <w:t>Check current folder:</w:t>
+      </w:r>
+      <w:r>
+        <w:t xml:space="preserve"> </w:t>
+      </w:r>
+      <w:r>
+        <w:rPr>
+          <w:highlight w:val="lightGray"/>
+        </w:rPr>
+        <w:t>cd</w:t>
+      </w:r>
+    </w:p>
+    <w:p>
+      <w:pPr>
+        <w:pStyle w:val="ListParagraph"/>
+        <w:spacing w:line="276" w:lineRule="auto"/>
+        <w:ind w:left="360"/>
+      </w:pPr>
+      <w:r>
+        <w:rPr>
+          <w:b/>
+          <w:bCs/>
+        </w:rPr>
+        <w:t>Example</w:t>
+      </w:r>
+      <w:r>
+        <w:t>:</w:t>
+      </w:r>
+    </w:p>
+    <w:p>
+      <w:pPr>
+        <w:pStyle w:val="ListParagraph"/>
+        <w:spacing w:line="276" w:lineRule="auto"/>
+        <w:ind w:left="360"/>
+      </w:pPr>
+      <w:r>
+        <w:t>Git Repository</w:t>
+      </w:r>
+      <w:r>
+        <w:t xml:space="preserve"> root</w:t>
+      </w:r>
+      <w:r>
+        <w:t>: D:\Github</w:t>
+      </w:r>
+      <w:r>
+        <w:t xml:space="preserve"> </w:t>
+      </w:r>
+    </w:p>
+    <w:p>
+      <w:pPr>
+        <w:pStyle w:val="ListParagraph"/>
+        <w:spacing w:line="276" w:lineRule="auto"/>
+        <w:ind w:left="360"/>
+      </w:pPr>
+      <w:r>
+        <w:t>Virtual Environment: D:\Github\vaibhav</w:t>
+      </w:r>
+    </w:p>
+    <w:p>
+      <w:pPr>
+        <w:pStyle w:val="ListParagraph"/>
+        <w:spacing w:line="276" w:lineRule="auto"/>
+        <w:ind w:left="360"/>
+      </w:pPr>
+      <w:r>
+        <w:t>Current Branch: main</w:t>
+      </w:r>
+      <w:r>
+        <w:t xml:space="preserve"> (</w:t>
+      </w:r>
+      <w:r>
+        <w:rPr>
+          <w:highlight w:val="lightGray"/>
+        </w:rPr>
+        <w:t>git branch</w:t>
+      </w:r>
+      <w:r>
+        <w:t>)</w:t>
+      </w:r>
+    </w:p>
+    <w:p>
+      <w:pPr>
+        <w:pStyle w:val="ListParagraph"/>
+        <w:spacing w:line="360" w:lineRule="auto"/>
+        <w:ind w:left="357"/>
+        <w:rPr>
+          <w:i/>
+          <w:iCs/>
+        </w:rPr>
+      </w:pPr>
+      <w:r>
+        <w:t>Remote Repository:</w:t>
+      </w:r>
+      <w:r>
+        <w:t xml:space="preserve"> </w:t>
+      </w:r>
+      <w:r>
+        <w:rPr>
+          <w:i/>
+          <w:iCs/>
+        </w:rPr>
+        <w:t>https://github.com/vkabdwal/vscode_vk.git</w:t>
+      </w:r>
+    </w:p>
+    <w:p>
+      <w:pPr>
+        <w:pStyle w:val="ListParagraph"/>
+        <w:spacing w:line="360" w:lineRule="auto"/>
+        <w:ind w:left="357"/>
+      </w:pPr>
+      <w:r>
+        <w:t>All of these can coexist and serve different purposes.</w:t>
+      </w:r>
+    </w:p>
+    <w:p>
+      <w:pPr>
+        <w:pStyle w:val="ListParagraph"/>
+        <w:spacing w:line="360" w:lineRule="auto"/>
+        <w:ind w:left="357"/>
+        <w:rPr>
+          <w:b/>
+          <w:bCs/>
+        </w:rPr>
+      </w:pPr>
+      <w:r>
+        <w:rPr>
+          <w:b/>
+          <w:bCs/>
+        </w:rPr>
+        <w:t>Important Lesson</w:t>
+      </w:r>
+    </w:p>
+    <w:p>
+      <w:pPr>
+        <w:pStyle w:val="ListParagraph"/>
+        <w:numPr>
+          <w:ilvl w:val="0"/>
+          <w:numId w:val="19"/>
+        </w:numPr>
+        <w:spacing w:line="276" w:lineRule="auto"/>
+      </w:pPr>
+      <w:r>
+        <w:rPr>
+          <w:highlight w:val="cyan"/>
+        </w:rPr>
+        <w:t>The current terminal location, the Git repository location, and the Python virtual environment location do NOT have to be the same.</w:t>
+      </w:r>
+    </w:p>
+    <w:p>
+      <w:pPr>
+        <w:pStyle w:val="ListParagraph"/>
+        <w:numPr>
+          <w:ilvl w:val="0"/>
+          <w:numId w:val="19"/>
+        </w:numPr>
+        <w:spacing w:line="276" w:lineRule="auto"/>
+      </w:pPr>
+      <w:r>
+        <w:t>Git determines the current branch based on the repository you are currently inside.</w:t>
+      </w:r>
+      <w:r>
+        <w:t xml:space="preserve"> </w:t>
+      </w:r>
+      <w:r>
+        <w:t>Since each repository maintains its own branches and history, the branch displayed by Git may change automatically when you change directories.</w:t>
+      </w:r>
+      <w:r>
+        <w:t xml:space="preserve"> </w:t>
+      </w:r>
+      <w:proofErr w:type="gramStart"/>
+      <w:r>
+        <w:rPr>
+          <w:highlight w:val="cyan"/>
+        </w:rPr>
+        <w:t>So</w:t>
+      </w:r>
+      <w:proofErr w:type="gramEnd"/>
+      <w:r>
+        <w:rPr>
+          <w:highlight w:val="cyan"/>
+        </w:rPr>
+        <w:t xml:space="preserve"> cd command can also change </w:t>
+      </w:r>
+      <w:r>
+        <w:rPr>
+          <w:highlight w:val="cyan"/>
+        </w:rPr>
+        <w:t>the repository that Git is operating on</w:t>
+      </w:r>
+      <w:r>
+        <w:t xml:space="preserve">. Recommended to always use </w:t>
+      </w:r>
+      <w:r>
+        <w:rPr>
+          <w:highlight w:val="lightGray"/>
+        </w:rPr>
+        <w:t>git remote -v</w:t>
+      </w:r>
+      <w:r>
+        <w:t xml:space="preserve"> to check existing repo.</w:t>
+      </w:r>
+    </w:p>
+    <w:p>
+      <w:pPr>
+        <w:pStyle w:val="ListParagraph"/>
+        <w:spacing w:line="276" w:lineRule="auto"/>
+        <w:ind w:left="360"/>
+        <w:rPr>
+          <w:b/>
+          <w:bCs/>
+        </w:rPr>
+      </w:pPr>
+    </w:p>
+    <w:p>
+      <w:pPr>
+        <w:pStyle w:val="ListParagraph"/>
+        <w:spacing w:line="276" w:lineRule="auto"/>
+        <w:ind w:left="360"/>
+        <w:rPr>
+          <w:b/>
+          <w:bCs/>
+        </w:rPr>
+      </w:pPr>
+      <w:r>
+        <w:rPr>
+          <w:b/>
+          <w:bCs/>
+        </w:rPr>
+        <w:t xml:space="preserve">Why We </w:t>
+      </w:r>
+      <w:proofErr w:type="gramStart"/>
+      <w:r>
+        <w:rPr>
+          <w:b/>
+          <w:bCs/>
+        </w:rPr>
+        <w:t>a</w:t>
+      </w:r>
+      <w:r>
+        <w:rPr>
+          <w:b/>
+          <w:bCs/>
+        </w:rPr>
+        <w:t>dded .</w:t>
+      </w:r>
+      <w:proofErr w:type="spellStart"/>
+      <w:r>
+        <w:rPr>
+          <w:b/>
+          <w:bCs/>
+        </w:rPr>
+        <w:t>gitignore</w:t>
+      </w:r>
+      <w:proofErr w:type="spellEnd"/>
+      <w:proofErr w:type="gramEnd"/>
+    </w:p>
+    <w:p>
+      <w:pPr>
+        <w:pStyle w:val="ListParagraph"/>
+        <w:spacing w:line="276" w:lineRule="auto"/>
+        <w:ind w:left="360"/>
+      </w:pPr>
+      <w:r>
+        <w:t>Virtual environments contain thousands of generated files that should not be pushed to GitHub.</w:t>
+      </w:r>
+    </w:p>
+    <w:p>
+      <w:pPr>
+        <w:pStyle w:val="ListParagraph"/>
+        <w:spacing w:line="276" w:lineRule="auto"/>
+        <w:ind w:left="360"/>
+      </w:pPr>
+      <w:proofErr w:type="gramStart"/>
+      <w:r>
+        <w:t>Typical .</w:t>
+      </w:r>
+      <w:proofErr w:type="spellStart"/>
+      <w:r>
+        <w:t>gitignore</w:t>
+      </w:r>
+      <w:proofErr w:type="spellEnd"/>
+      <w:proofErr w:type="gramEnd"/>
+      <w:r>
+        <w:t xml:space="preserve"> entries:</w:t>
+      </w:r>
+    </w:p>
+    <w:p>
+      <w:pPr>
+        <w:pStyle w:val="ListParagraph"/>
+        <w:spacing w:line="276" w:lineRule="auto"/>
+        <w:ind w:left="360"/>
+      </w:pPr>
+      <w:proofErr w:type="gramStart"/>
+      <w:r>
+        <w:t>.</w:t>
+      </w:r>
+      <w:proofErr w:type="spellStart"/>
+      <w:r>
+        <w:t>venv</w:t>
+      </w:r>
+      <w:proofErr w:type="spellEnd"/>
+      <w:proofErr w:type="gramEnd"/>
+      <w:r>
+        <w:t>/</w:t>
+      </w:r>
+    </w:p>
+    <w:p>
+      <w:pPr>
+        <w:pStyle w:val="ListParagraph"/>
+        <w:spacing w:line="276" w:lineRule="auto"/>
+        <w:ind w:left="360"/>
+      </w:pPr>
+      <w:r>
+        <w:t>vaibhav/</w:t>
+      </w:r>
+    </w:p>
+    <w:p>
+      <w:pPr>
+        <w:pStyle w:val="ListParagraph"/>
+        <w:spacing w:line="276" w:lineRule="auto"/>
+        <w:ind w:left="360"/>
+      </w:pPr>
+      <w:r>
+        <w:t>__</w:t>
+      </w:r>
+      <w:proofErr w:type="spellStart"/>
+      <w:r>
+        <w:t>pycache</w:t>
+      </w:r>
+      <w:proofErr w:type="spellEnd"/>
+      <w:r>
+        <w:t>__/</w:t>
+      </w:r>
+    </w:p>
+    <w:p>
+      <w:pPr>
+        <w:pStyle w:val="ListParagraph"/>
+        <w:spacing w:line="276" w:lineRule="auto"/>
+        <w:ind w:left="360"/>
+      </w:pPr>
+      <w:r>
+        <w:t>*.</w:t>
+      </w:r>
+      <w:proofErr w:type="spellStart"/>
+      <w:r>
+        <w:t>pyc</w:t>
+      </w:r>
+      <w:proofErr w:type="spellEnd"/>
+    </w:p>
+    <w:p>
+      <w:pPr>
+        <w:pStyle w:val="ListParagraph"/>
+        <w:spacing w:line="360" w:lineRule="auto"/>
+        <w:ind w:left="357"/>
+      </w:pPr>
+      <w:proofErr w:type="gramStart"/>
+      <w:r>
+        <w:t>.</w:t>
+      </w:r>
+      <w:proofErr w:type="spellStart"/>
+      <w:r>
+        <w:t>vscode</w:t>
+      </w:r>
+      <w:proofErr w:type="spellEnd"/>
+      <w:proofErr w:type="gramEnd"/>
+      <w:r>
+        <w:t>/</w:t>
+      </w:r>
+    </w:p>
+    <w:p>
+      <w:pPr>
+        <w:pStyle w:val="ListParagraph"/>
+        <w:spacing w:line="276" w:lineRule="auto"/>
+        <w:ind w:left="360"/>
+      </w:pPr>
+      <w:r>
+        <w:t>This prevents Git from tracking generated files while keeping the virtual environment usable locally.</w:t>
+      </w:r>
+    </w:p>
+    <w:p>
+      <w:pPr>
         <w:pStyle w:val="Heading1"/>
         <w:numPr>
           <w:ilvl w:val="0"/>
@@ -1261,7 +3074,7 @@
                     <pic:cNvPicPr/>
                   </pic:nvPicPr>
                   <pic:blipFill>
-                    <a:blip r:embed="rId10">
+                    <a:blip r:embed="rId11">
                       <a:extLst>
                         <a:ext uri="{28A0092B-C50C-407E-A947-70E740481C1C}">
                           <a14:useLocalDpi xmlns:a14="http://schemas.microsoft.com/office/drawing/2010/main" val="0"/>
@@ -1526,8 +3339,36 @@
           <w:b/>
           <w:bCs/>
         </w:rPr>
-        <w:lastRenderedPageBreak/>
-        <w:t>Check your remotes:</w:t>
+        <w:t>Check your remotes</w:t>
+      </w:r>
+      <w:r>
+        <w:rPr>
+          <w:b/>
+          <w:bCs/>
+        </w:rPr>
+        <w:t xml:space="preserve"> (</w:t>
+      </w:r>
+      <w:r>
+        <w:rPr>
+          <w:b/>
+          <w:bCs/>
+          <w:highlight w:val="cyan"/>
+        </w:rPr>
+        <w:t>check which repo we are in</w:t>
+      </w:r>
+      <w:r>
+        <w:rPr>
+          <w:b/>
+          <w:bCs/>
+        </w:rPr>
+        <w:t>)</w:t>
+      </w:r>
+      <w:r>
+        <w:rPr>
+          <w:b/>
+          <w:bCs/>
+        </w:rPr>
+        <w:t>:</w:t>
       </w:r>
     </w:p>
     <w:p>
@@ -1577,6 +3418,7 @@
         <w:ind w:left="360"/>
       </w:pPr>
       <w:r>
+        <w:lastRenderedPageBreak/>
         <w:t>git remote add origin https://github.com/yourusername/yourrepo.git</w:t>
       </w:r>
     </w:p>
@@ -1594,7 +3436,7 @@
       <w:r>
         <w:t>like </w:t>
       </w:r>
-      <w:hyperlink r:id="rId11" w:history="1">
+      <w:hyperlink r:id="rId12" w:history="1">
         <w:r>
           <w:rPr>
             <w:rStyle w:val="Hyperlink"/>
@@ -1775,7 +3617,21 @@
         <w:rPr>
           <w:highlight w:val="lightGray"/>
         </w:rPr>
-        <w:t>git add .)</w:t>
+        <w:t xml:space="preserve">git </w:t>
+      </w:r>
+      <w:proofErr w:type="gramStart"/>
+      <w:r>
+        <w:rPr>
+          <w:highlight w:val="lightGray"/>
+        </w:rPr>
+        <w:t>add .</w:t>
+      </w:r>
+      <w:proofErr w:type="gramEnd"/>
+      <w:r>
+        <w:rPr>
+          <w:highlight w:val="lightGray"/>
+        </w:rPr>
+        <w:t>)</w:t>
       </w:r>
       <w:r>
         <w:t xml:space="preserve"> stages your changes.</w:t>
@@ -2077,7 +3933,7 @@
                     <pic:cNvPicPr/>
                   </pic:nvPicPr>
                   <pic:blipFill>
-                    <a:blip r:embed="rId12">
+                    <a:blip r:embed="rId13">
                       <a:extLst>
                         <a:ext uri="{28A0092B-C50C-407E-A947-70E740481C1C}">
                           <a14:useLocalDpi xmlns:a14="http://schemas.microsoft.com/office/drawing/2010/main" val="0"/>
@@ -2106,7 +3962,7 @@
     </w:p>
     <w:p>
       <w:pPr>
-        <w:spacing w:before="60" w:after="60" w:line="360" w:lineRule="auto"/>
+        <w:spacing w:before="40" w:after="40" w:line="240" w:lineRule="auto"/>
       </w:pPr>
       <w:r>
         <w:rPr>
@@ -2131,6 +3987,173 @@
         </w:rPr>
         <w:t>ou cannot directly edit the online GitHub repository (the "remote repo"). Instead, you work with a local copy of the repository on your laptop, make changes locally, and then push those changes to the desired branch on GitHub. Git is designed this way to ensure version control and collaboration safety.</w:t>
       </w:r>
+    </w:p>
+    <w:p>
+      <w:pPr>
+        <w:spacing w:before="40" w:after="40" w:line="240" w:lineRule="auto"/>
+      </w:pPr>
+    </w:p>
+    <w:p>
+      <w:pPr>
+        <w:spacing w:before="40" w:after="40" w:line="240" w:lineRule="auto"/>
+      </w:pPr>
+      <w:r>
+        <w:rPr>
+          <w:b/>
+          <w:bCs/>
+        </w:rPr>
+        <w:t>Tip:</w:t>
+      </w:r>
+      <w:r>
+        <w:t xml:space="preserve"> After staging (</w:t>
+      </w:r>
+      <w:r>
+        <w:rPr>
+          <w:highlight w:val="lightGray"/>
+        </w:rPr>
+        <w:t xml:space="preserve">git </w:t>
+      </w:r>
+      <w:proofErr w:type="gramStart"/>
+      <w:r>
+        <w:rPr>
+          <w:highlight w:val="lightGray"/>
+        </w:rPr>
+        <w:t>add .</w:t>
+      </w:r>
+      <w:proofErr w:type="gramEnd"/>
+      <w:r>
+        <w:t>), if we want to see which files are staged, we can use git status.</w:t>
+      </w:r>
+    </w:p>
+    <w:p>
+      <w:pPr>
+        <w:spacing w:before="40" w:after="40" w:line="240" w:lineRule="auto"/>
+      </w:pPr>
+      <w:r>
+        <w:rPr>
+          <w:noProof/>
+        </w:rPr>
+        <w:drawing>
+          <wp:inline distT="0" distB="0" distL="0" distR="0" wp14:anchorId="63D53327" wp14:editId="32BAB63C">
+            <wp:extent cx="5533292" cy="2103755"/>
+            <wp:effectExtent l="0" t="0" r="0" b="0"/>
+            <wp:docPr id="422008498" name="Picture 1"/>
+            <wp:cNvGraphicFramePr>
+              <a:graphicFrameLocks xmlns:a="http://schemas.openxmlformats.org/drawingml/2006/main" noChangeAspect="1"/>
+            </wp:cNvGraphicFramePr>
+            <a:graphic xmlns:a="http://schemas.openxmlformats.org/drawingml/2006/main">
+              <a:graphicData uri="http://schemas.openxmlformats.org/drawingml/2006/picture">
+                <pic:pic xmlns:pic="http://schemas.openxmlformats.org/drawingml/2006/picture">
+                  <pic:nvPicPr>
+                    <pic:cNvPr id="422008498" name=""/>
+                    <pic:cNvPicPr/>
+                  </pic:nvPicPr>
+                  <pic:blipFill>
+                    <a:blip r:embed="rId14">
+                      <a:extLst>
+                        <a:ext uri="{28A0092B-C50C-407E-A947-70E740481C1C}">
+                          <a14:useLocalDpi xmlns:a14="http://schemas.microsoft.com/office/drawing/2010/main" val="0"/>
+                        </a:ext>
+                      </a:extLst>
+                    </a:blip>
+                    <a:stretch>
+                      <a:fillRect/>
+                    </a:stretch>
+                  </pic:blipFill>
+                  <pic:spPr>
+                    <a:xfrm>
+                      <a:off x="0" y="0"/>
+                      <a:ext cx="5544690" cy="2108089"/>
+                    </a:xfrm>
+                    <a:prstGeom prst="rect">
+                      <a:avLst/>
+                    </a:prstGeom>
+                  </pic:spPr>
+                </pic:pic>
+              </a:graphicData>
+            </a:graphic>
+          </wp:inline>
+        </w:drawing>
+      </w:r>
+    </w:p>
+    <w:p>
+      <w:pPr>
+        <w:spacing w:before="40" w:after="40" w:line="240" w:lineRule="auto"/>
+      </w:pPr>
+      <w:r>
+        <w:rPr>
+          <w:u w:val="single"/>
+        </w:rPr>
+        <w:t>example</w:t>
+      </w:r>
+      <w:r>
+        <w:t>:</w:t>
+      </w:r>
+    </w:p>
+    <w:p>
+      <w:pPr>
+        <w:spacing w:before="40" w:after="40" w:line="240" w:lineRule="auto"/>
+      </w:pPr>
+      <w:r>
+        <w:rPr>
+          <w:noProof/>
+        </w:rPr>
+        <w:drawing>
+          <wp:inline distT="0" distB="0" distL="0" distR="0" wp14:anchorId="430C088A" wp14:editId="697A0EE8">
+            <wp:extent cx="2784231" cy="2244665"/>
+            <wp:effectExtent l="0" t="0" r="0" b="3810"/>
+            <wp:docPr id="371356216" name="Picture 1"/>
+            <wp:cNvGraphicFramePr>
+              <a:graphicFrameLocks xmlns:a="http://schemas.openxmlformats.org/drawingml/2006/main" noChangeAspect="1"/>
+            </wp:cNvGraphicFramePr>
+            <a:graphic xmlns:a="http://schemas.openxmlformats.org/drawingml/2006/main">
+              <a:graphicData uri="http://schemas.openxmlformats.org/drawingml/2006/picture">
+                <pic:pic xmlns:pic="http://schemas.openxmlformats.org/drawingml/2006/picture">
+                  <pic:nvPicPr>
+                    <pic:cNvPr id="371356216" name=""/>
+                    <pic:cNvPicPr/>
+                  </pic:nvPicPr>
+                  <pic:blipFill rotWithShape="1">
+                    <a:blip r:embed="rId15">
+                      <a:extLst>
+                        <a:ext uri="{28A0092B-C50C-407E-A947-70E740481C1C}">
+                          <a14:useLocalDpi xmlns:a14="http://schemas.microsoft.com/office/drawing/2010/main" val="0"/>
+                        </a:ext>
+                      </a:extLst>
+                    </a:blip>
+                    <a:srcRect t="33494" r="24482"/>
+                    <a:stretch>
+                      <a:fillRect/>
+                    </a:stretch>
+                  </pic:blipFill>
+                  <pic:spPr bwMode="auto">
+                    <a:xfrm>
+                      <a:off x="0" y="0"/>
+                      <a:ext cx="2788915" cy="2248441"/>
+                    </a:xfrm>
+                    <a:prstGeom prst="rect">
+                      <a:avLst/>
+                    </a:prstGeom>
+                    <a:ln>
+                      <a:noFill/>
+                    </a:ln>
+                    <a:extLst>
+                      <a:ext uri="{53640926-AAD7-44D8-BBD7-CCE9431645EC}">
+                        <a14:shadowObscured xmlns:a14="http://schemas.microsoft.com/office/drawing/2010/main"/>
+                      </a:ext>
+                    </a:extLst>
+                  </pic:spPr>
+                </pic:pic>
+              </a:graphicData>
+            </a:graphic>
+          </wp:inline>
+        </w:drawing>
+      </w:r>
+    </w:p>
+    <w:p>
+      <w:pPr>
+        <w:spacing w:before="40" w:after="40" w:line="240" w:lineRule="auto"/>
+      </w:pPr>
     </w:p>
     <w:p>
       <w:pPr>
@@ -2155,6 +4178,7 @@
           <w:sz w:val="24"/>
           <w:szCs w:val="24"/>
         </w:rPr>
+        <w:lastRenderedPageBreak/>
         <w:t xml:space="preserve">Pulling code from a </w:t>
       </w:r>
       <w:r>
@@ -2202,7 +4226,7 @@
                     <pic:cNvPicPr/>
                   </pic:nvPicPr>
                   <pic:blipFill rotWithShape="1">
-                    <a:blip r:embed="rId13">
+                    <a:blip r:embed="rId16">
                       <a:extLst>
                         <a:ext uri="{28A0092B-C50C-407E-A947-70E740481C1C}">
                           <a14:useLocalDpi xmlns:a14="http://schemas.microsoft.com/office/drawing/2010/main" val="0"/>
@@ -2251,7 +4275,6 @@
         <w:rPr>
           <w:noProof/>
         </w:rPr>
-        <w:lastRenderedPageBreak/>
         <w:drawing>
           <wp:inline distT="0" distB="0" distL="0" distR="0" wp14:anchorId="77D94DCE" wp14:editId="463FD747">
             <wp:extent cx="4447540" cy="2553004"/>
@@ -2268,7 +4291,7 @@
                     <pic:cNvPicPr/>
                   </pic:nvPicPr>
                   <pic:blipFill rotWithShape="1">
-                    <a:blip r:embed="rId13">
+                    <a:blip r:embed="rId16">
                       <a:extLst>
                         <a:ext uri="{28A0092B-C50C-407E-A947-70E740481C1C}">
                           <a14:useLocalDpi xmlns:a14="http://schemas.microsoft.com/office/drawing/2010/main" val="0"/>
@@ -2395,6 +4418,7 @@
         <w:rPr>
           <w:noProof/>
         </w:rPr>
+        <w:lastRenderedPageBreak/>
         <w:drawing>
           <wp:inline distT="0" distB="0" distL="0" distR="0" wp14:anchorId="7785A771" wp14:editId="5D7594C8">
             <wp:extent cx="6153404" cy="2291862"/>
@@ -2411,7 +4435,7 @@
                     <pic:cNvPicPr/>
                   </pic:nvPicPr>
                   <pic:blipFill rotWithShape="1">
-                    <a:blip r:embed="rId14">
+                    <a:blip r:embed="rId17">
                       <a:extLst>
                         <a:ext uri="{28A0092B-C50C-407E-A947-70E740481C1C}">
                           <a14:useLocalDpi xmlns:a14="http://schemas.microsoft.com/office/drawing/2010/main" val="0"/>
@@ -2474,7 +4498,7 @@
                     <pic:cNvPicPr/>
                   </pic:nvPicPr>
                   <pic:blipFill>
-                    <a:blip r:embed="rId15">
+                    <a:blip r:embed="rId18">
                       <a:extLst>
                         <a:ext uri="{28A0092B-C50C-407E-A947-70E740481C1C}">
                           <a14:useLocalDpi xmlns:a14="http://schemas.microsoft.com/office/drawing/2010/main" val="0"/>
@@ -2509,7 +4533,6 @@
         <w:rPr>
           <w:noProof/>
         </w:rPr>
-        <w:lastRenderedPageBreak/>
         <w:drawing>
           <wp:inline distT="0" distB="0" distL="0" distR="0" wp14:anchorId="6C088930" wp14:editId="1E408019">
             <wp:extent cx="6153404" cy="3194148"/>
@@ -2526,7 +4549,7 @@
                     <pic:cNvPicPr/>
                   </pic:nvPicPr>
                   <pic:blipFill rotWithShape="1">
-                    <a:blip r:embed="rId14">
+                    <a:blip r:embed="rId17">
                       <a:extLst>
                         <a:ext uri="{28A0092B-C50C-407E-A947-70E740481C1C}">
                           <a14:useLocalDpi xmlns:a14="http://schemas.microsoft.com/office/drawing/2010/main" val="0"/>
@@ -2571,6 +4594,7 @@
         <w:rPr>
           <w:noProof/>
         </w:rPr>
+        <w:lastRenderedPageBreak/>
         <w:drawing>
           <wp:inline distT="0" distB="0" distL="0" distR="0" wp14:anchorId="0667F556" wp14:editId="2508DE68">
             <wp:extent cx="6388016" cy="3622431"/>
@@ -2587,7 +4611,7 @@
                     <pic:cNvPicPr/>
                   </pic:nvPicPr>
                   <pic:blipFill rotWithShape="1">
-                    <a:blip r:embed="rId16">
+                    <a:blip r:embed="rId19">
                       <a:extLst>
                         <a:ext uri="{28A0092B-C50C-407E-A947-70E740481C1C}">
                           <a14:useLocalDpi xmlns:a14="http://schemas.microsoft.com/office/drawing/2010/main" val="0"/>
@@ -2631,7 +4655,6 @@
         <w:rPr>
           <w:noProof/>
         </w:rPr>
-        <w:lastRenderedPageBreak/>
         <w:drawing>
           <wp:inline distT="0" distB="0" distL="0" distR="0" wp14:anchorId="1B417A04" wp14:editId="214C2932">
             <wp:extent cx="6487388" cy="2731477"/>
@@ -2648,7 +4671,7 @@
                     <pic:cNvPicPr/>
                   </pic:nvPicPr>
                   <pic:blipFill rotWithShape="1">
-                    <a:blip r:embed="rId16">
+                    <a:blip r:embed="rId19">
                       <a:extLst>
                         <a:ext uri="{28A0092B-C50C-407E-A947-70E740481C1C}">
                           <a14:useLocalDpi xmlns:a14="http://schemas.microsoft.com/office/drawing/2010/main" val="0"/>
@@ -2708,7 +4731,7 @@
                     <pic:cNvPicPr/>
                   </pic:nvPicPr>
                   <pic:blipFill>
-                    <a:blip r:embed="rId17">
+                    <a:blip r:embed="rId20">
                       <a:extLst>
                         <a:ext uri="{28A0092B-C50C-407E-A947-70E740481C1C}">
                           <a14:useLocalDpi xmlns:a14="http://schemas.microsoft.com/office/drawing/2010/main" val="0"/>
@@ -2748,6 +4771,7 @@
         <w:rPr>
           <w:noProof/>
         </w:rPr>
+        <w:lastRenderedPageBreak/>
         <w:drawing>
           <wp:inline distT="0" distB="0" distL="0" distR="0" wp14:anchorId="7F0312CE" wp14:editId="33F5606C">
             <wp:extent cx="6271803" cy="3101609"/>
@@ -2764,7 +4788,7 @@
                     <pic:cNvPicPr/>
                   </pic:nvPicPr>
                   <pic:blipFill>
-                    <a:blip r:embed="rId18">
+                    <a:blip r:embed="rId21">
                       <a:extLst>
                         <a:ext uri="{28A0092B-C50C-407E-A947-70E740481C1C}">
                           <a14:useLocalDpi xmlns:a14="http://schemas.microsoft.com/office/drawing/2010/main" val="0"/>
@@ -2799,7 +4823,6 @@
         <w:rPr>
           <w:noProof/>
         </w:rPr>
-        <w:lastRenderedPageBreak/>
         <w:drawing>
           <wp:inline distT="0" distB="0" distL="0" distR="0" wp14:anchorId="6421E108" wp14:editId="73113EBB">
             <wp:extent cx="6645910" cy="3789045"/>
@@ -2816,7 +4839,7 @@
                     <pic:cNvPicPr/>
                   </pic:nvPicPr>
                   <pic:blipFill>
-                    <a:blip r:embed="rId19">
+                    <a:blip r:embed="rId22">
                       <a:extLst>
                         <a:ext uri="{28A0092B-C50C-407E-A947-70E740481C1C}">
                           <a14:useLocalDpi xmlns:a14="http://schemas.microsoft.com/office/drawing/2010/main" val="0"/>
@@ -2994,7 +5017,11 @@
       </w:r>
       <w:proofErr w:type="spellEnd"/>
       <w:r>
-        <w:t xml:space="preserve">). This can be done by creating a pull request (PR) on GitHub to merge </w:t>
+        <w:t xml:space="preserve">). This can be done by </w:t>
+      </w:r>
+      <w:r>
+        <w:lastRenderedPageBreak/>
+        <w:t xml:space="preserve">creating a pull request (PR) on GitHub to merge </w:t>
       </w:r>
       <w:proofErr w:type="spellStart"/>
       <w:r>
@@ -3049,21 +5076,26 @@
     </w:p>
     <w:p>
       <w:pPr>
-        <w:pStyle w:val="ListParagraph"/>
+        <w:pStyle w:val="Heading2"/>
         <w:numPr>
           <w:ilvl w:val="0"/>
-          <w:numId w:val="14"/>
+          <w:numId w:val="7"/>
         </w:numPr>
-        <w:spacing w:line="276" w:lineRule="auto"/>
-        <w:rPr>
-          <w:b/>
-          <w:bCs/>
-        </w:rPr>
-      </w:pPr>
-      <w:r>
-        <w:rPr>
-          <w:b/>
-          <w:bCs/>
+        <w:rPr>
+          <w:rFonts w:ascii="Arial" w:hAnsi="Arial" w:cs="Arial"/>
+          <w:b/>
+          <w:bCs/>
+          <w:sz w:val="24"/>
+          <w:szCs w:val="24"/>
+        </w:rPr>
+      </w:pPr>
+      <w:r>
+        <w:rPr>
+          <w:rFonts w:ascii="Arial" w:hAnsi="Arial" w:cs="Arial"/>
+          <w:b/>
+          <w:bCs/>
+          <w:sz w:val="24"/>
+          <w:szCs w:val="24"/>
         </w:rPr>
         <w:t>Deleting a branch</w:t>
       </w:r>
@@ -3078,7 +5110,6 @@
         <w:rPr>
           <w:noProof/>
         </w:rPr>
-        <w:lastRenderedPageBreak/>
         <w:drawing>
           <wp:inline distT="0" distB="0" distL="0" distR="0" wp14:anchorId="10ACA02E" wp14:editId="24620FE6">
             <wp:extent cx="6313170" cy="4214191"/>
@@ -3095,7 +5126,7 @@
                     <pic:cNvPicPr/>
                   </pic:nvPicPr>
                   <pic:blipFill>
-                    <a:blip r:embed="rId20">
+                    <a:blip r:embed="rId23">
                       <a:extLst>
                         <a:ext uri="{28A0092B-C50C-407E-A947-70E740481C1C}">
                           <a14:useLocalDpi xmlns:a14="http://schemas.microsoft.com/office/drawing/2010/main" val="0"/>
@@ -3122,6 +5153,1061 @@
         </w:drawing>
       </w:r>
     </w:p>
+    <w:p>
+      <w:pPr>
+        <w:pStyle w:val="ListParagraph"/>
+        <w:spacing w:line="276" w:lineRule="auto"/>
+        <w:ind w:left="360"/>
+      </w:pPr>
+    </w:p>
+    <w:p>
+      <w:pPr>
+        <w:pStyle w:val="Heading2"/>
+        <w:numPr>
+          <w:ilvl w:val="0"/>
+          <w:numId w:val="7"/>
+        </w:numPr>
+        <w:rPr>
+          <w:rFonts w:ascii="Arial" w:hAnsi="Arial" w:cs="Arial"/>
+          <w:b/>
+          <w:bCs/>
+          <w:sz w:val="24"/>
+          <w:szCs w:val="24"/>
+        </w:rPr>
+      </w:pPr>
+      <w:r>
+        <w:rPr>
+          <w:rFonts w:ascii="Arial" w:hAnsi="Arial" w:cs="Arial"/>
+          <w:b/>
+          <w:bCs/>
+          <w:sz w:val="24"/>
+          <w:szCs w:val="24"/>
+        </w:rPr>
+        <w:t>Remove Files/Folders from the Staging Area</w:t>
+      </w:r>
+    </w:p>
+    <w:p>
+      <w:r>
+        <w:t>Sometimes a file or folder is accidentally staged using:</w:t>
+      </w:r>
+      <w:r>
+        <w:t xml:space="preserve"> </w:t>
+      </w:r>
+      <w:r>
+        <w:t xml:space="preserve">git </w:t>
+      </w:r>
+      <w:proofErr w:type="gramStart"/>
+      <w:r>
+        <w:t>add .</w:t>
+      </w:r>
+      <w:proofErr w:type="gramEnd"/>
+    </w:p>
+    <w:p>
+      <w:pPr>
+        <w:rPr>
+          <w:b/>
+          <w:bCs/>
+        </w:rPr>
+      </w:pPr>
+      <w:r>
+        <w:rPr>
+          <w:b/>
+          <w:bCs/>
+        </w:rPr>
+        <w:t>To remove it from the staging area without deleting it from your computer:</w:t>
+      </w:r>
+    </w:p>
+    <w:p>
+      <w:pPr>
+        <w:pStyle w:val="ListParagraph"/>
+        <w:numPr>
+          <w:ilvl w:val="0"/>
+          <w:numId w:val="23"/>
+        </w:numPr>
+        <w:spacing w:after="0"/>
+      </w:pPr>
+      <w:r>
+        <w:t>Remove a specific file from staging:</w:t>
+      </w:r>
+      <w:r>
+        <w:t xml:space="preserve"> </w:t>
+      </w:r>
+      <w:r>
+        <w:rPr>
+          <w:highlight w:val="lightGray"/>
+        </w:rPr>
+        <w:t>git restore --staged filename.py</w:t>
+      </w:r>
+    </w:p>
+    <w:p>
+      <w:r>
+        <w:t>Example:</w:t>
+      </w:r>
+      <w:r>
+        <w:t xml:space="preserve"> </w:t>
+      </w:r>
+      <w:r>
+        <w:t>git restore --staged interview_questions.py</w:t>
+      </w:r>
+    </w:p>
+    <w:p>
+      <w:pPr>
+        <w:pStyle w:val="ListParagraph"/>
+        <w:numPr>
+          <w:ilvl w:val="0"/>
+          <w:numId w:val="23"/>
+        </w:numPr>
+        <w:spacing w:after="0"/>
+      </w:pPr>
+      <w:r>
+        <w:t>Remove a specific folder from staging:</w:t>
+      </w:r>
+      <w:r>
+        <w:t xml:space="preserve"> </w:t>
+      </w:r>
+      <w:r>
+        <w:rPr>
+          <w:highlight w:val="lightGray"/>
+        </w:rPr>
+        <w:t xml:space="preserve">git restore --staged </w:t>
+      </w:r>
+      <w:proofErr w:type="spellStart"/>
+      <w:r>
+        <w:rPr>
+          <w:highlight w:val="lightGray"/>
+        </w:rPr>
+        <w:t>folder_name</w:t>
+      </w:r>
+      <w:proofErr w:type="spellEnd"/>
+    </w:p>
+    <w:p>
+      <w:r>
+        <w:t>Example:</w:t>
+      </w:r>
+      <w:r>
+        <w:t xml:space="preserve"> </w:t>
+      </w:r>
+      <w:r>
+        <w:t>git restore --staged Complete-Python-Bootcamp</w:t>
+      </w:r>
+    </w:p>
+    <w:p>
+      <w:pPr>
+        <w:pStyle w:val="ListParagraph"/>
+        <w:numPr>
+          <w:ilvl w:val="0"/>
+          <w:numId w:val="23"/>
+        </w:numPr>
+        <w:spacing w:after="0"/>
+      </w:pPr>
+      <w:r>
+        <w:t>Alternative (older command):</w:t>
+      </w:r>
+      <w:r>
+        <w:t xml:space="preserve"> </w:t>
+      </w:r>
+      <w:r>
+        <w:rPr>
+          <w:highlight w:val="lightGray"/>
+        </w:rPr>
+        <w:t>git rm --cached filename</w:t>
+      </w:r>
+    </w:p>
+    <w:p>
+      <w:pPr>
+        <w:spacing w:after="0"/>
+      </w:pPr>
+      <w:r>
+        <w:t>Example:</w:t>
+      </w:r>
+      <w:r>
+        <w:t xml:space="preserve"> </w:t>
+      </w:r>
+      <w:r>
+        <w:t>git rm --cached interview_questions.py</w:t>
+      </w:r>
+    </w:p>
+    <w:p>
+      <w:pPr>
+        <w:pStyle w:val="ListParagraph"/>
+        <w:numPr>
+          <w:ilvl w:val="0"/>
+          <w:numId w:val="23"/>
+        </w:numPr>
+        <w:spacing w:after="0"/>
+      </w:pPr>
+      <w:r>
+        <w:t>For folders:</w:t>
+      </w:r>
+      <w:r>
+        <w:t xml:space="preserve"> </w:t>
+      </w:r>
+      <w:r>
+        <w:rPr>
+          <w:highlight w:val="lightGray"/>
+        </w:rPr>
+        <w:t xml:space="preserve">git rm -r --cached </w:t>
+      </w:r>
+      <w:proofErr w:type="spellStart"/>
+      <w:r>
+        <w:rPr>
+          <w:highlight w:val="lightGray"/>
+        </w:rPr>
+        <w:t>folder_name</w:t>
+      </w:r>
+      <w:proofErr w:type="spellEnd"/>
+    </w:p>
+    <w:p>
+      <w:pPr>
+        <w:spacing w:after="0"/>
+      </w:pPr>
+      <w:r>
+        <w:t>Example:</w:t>
+      </w:r>
+      <w:r>
+        <w:t xml:space="preserve"> </w:t>
+      </w:r>
+      <w:r>
+        <w:t>git rm -r --cached Complete-Python-Bootcamp</w:t>
+      </w:r>
+    </w:p>
+    <w:p/>
+    <w:p>
+      <w:r>
+        <w:t>Important:</w:t>
+      </w:r>
+    </w:p>
+    <w:p>
+      <w:r>
+        <w:t>• git restore --staged removes the file/folder only from the staging area.</w:t>
+      </w:r>
+      <w:r>
+        <w:br/>
+        <w:t>• The file remains on your computer.</w:t>
+      </w:r>
+      <w:r>
+        <w:br/>
+        <w:t>• The change simply won't be included in the next commit.</w:t>
+      </w:r>
+    </w:p>
+    <w:p>
+      <w:r>
+        <w:t>The folder will remain on disk but will no longer be part of the next commit.</w:t>
+      </w:r>
+    </w:p>
+    <w:p>
+      <w:r>
+        <w:t>To verify what is currently staged:</w:t>
+      </w:r>
+      <w:r>
+        <w:t xml:space="preserve"> </w:t>
+      </w:r>
+      <w:r>
+        <w:t>git status</w:t>
+      </w:r>
+    </w:p>
+    <w:p>
+      <w:pPr>
+        <w:pStyle w:val="Heading2"/>
+        <w:numPr>
+          <w:ilvl w:val="0"/>
+          <w:numId w:val="7"/>
+        </w:numPr>
+        <w:rPr>
+          <w:rFonts w:ascii="Arial" w:hAnsi="Arial" w:cs="Arial"/>
+          <w:b/>
+          <w:bCs/>
+          <w:sz w:val="24"/>
+          <w:szCs w:val="24"/>
+        </w:rPr>
+      </w:pPr>
+      <w:r>
+        <w:rPr>
+          <w:rFonts w:ascii="Arial" w:hAnsi="Arial" w:cs="Arial"/>
+          <w:b/>
+          <w:bCs/>
+          <w:sz w:val="24"/>
+          <w:szCs w:val="24"/>
+        </w:rPr>
+        <w:t>Cloning Online Repo</w:t>
+      </w:r>
+    </w:p>
+    <w:p>
+      <w:pPr>
+        <w:pStyle w:val="ListParagraph"/>
+        <w:spacing w:line="276" w:lineRule="auto"/>
+        <w:ind w:left="360"/>
+        <w:rPr>
+          <w:i/>
+          <w:iCs/>
+        </w:rPr>
+      </w:pPr>
+      <w:r>
+        <w:t xml:space="preserve">I cloned one online trainer branch to my git account: </w:t>
+      </w:r>
+      <w:hyperlink r:id="rId24" w:history="1">
+        <w:r>
+          <w:rPr>
+            <w:rStyle w:val="Hyperlink"/>
+            <w:i/>
+            <w:iCs/>
+          </w:rPr>
+          <w:t>https://github.com/vkabdwal/Complete-Python-Bootcamp</w:t>
+        </w:r>
+      </w:hyperlink>
+    </w:p>
+    <w:p>
+      <w:pPr>
+        <w:pStyle w:val="ListParagraph"/>
+        <w:spacing w:line="276" w:lineRule="auto"/>
+        <w:ind w:left="360"/>
+      </w:pPr>
+    </w:p>
+    <w:p>
+      <w:pPr>
+        <w:pStyle w:val="ListParagraph"/>
+        <w:numPr>
+          <w:ilvl w:val="0"/>
+          <w:numId w:val="22"/>
+        </w:numPr>
+        <w:spacing w:line="276" w:lineRule="auto"/>
+      </w:pPr>
+      <w:r>
+        <w:t xml:space="preserve">Now I wanted it in local. </w:t>
+      </w:r>
+      <w:r>
+        <w:t>Obviously,</w:t>
+      </w:r>
+      <w:r>
+        <w:t xml:space="preserve"> it is logical to store it in my </w:t>
+      </w:r>
+      <w:proofErr w:type="spellStart"/>
+      <w:r>
+        <w:t>git</w:t>
+      </w:r>
+      <w:proofErr w:type="spellEnd"/>
+      <w:r>
+        <w:t xml:space="preserve"> repo. folder and if I just clone, by default it will come to my </w:t>
+      </w:r>
+      <w:proofErr w:type="spellStart"/>
+      <w:r>
+        <w:t>git</w:t>
+      </w:r>
+      <w:proofErr w:type="spellEnd"/>
+      <w:r>
+        <w:t xml:space="preserve"> repo folder only.</w:t>
+      </w:r>
+      <w:r>
+        <w:t xml:space="preserve"> </w:t>
+      </w:r>
+    </w:p>
+    <w:p>
+      <w:pPr>
+        <w:pStyle w:val="ListParagraph"/>
+        <w:numPr>
+          <w:ilvl w:val="0"/>
+          <w:numId w:val="22"/>
+        </w:numPr>
+        <w:spacing w:line="276" w:lineRule="auto"/>
+      </w:pPr>
+      <w:r>
+        <w:t>Check repo folder:</w:t>
+      </w:r>
+    </w:p>
+    <w:p>
+      <w:pPr>
+        <w:pStyle w:val="ListParagraph"/>
+        <w:spacing w:line="276" w:lineRule="auto"/>
+        <w:ind w:left="360"/>
+      </w:pPr>
+      <w:r>
+        <w:rPr>
+          <w:noProof/>
+        </w:rPr>
+        <w:drawing>
+          <wp:inline distT="0" distB="0" distL="0" distR="0" wp14:anchorId="67FAC8A4" wp14:editId="1083DA84">
+            <wp:extent cx="3848433" cy="396274"/>
+            <wp:effectExtent l="38100" t="38100" r="95250" b="99060"/>
+            <wp:docPr id="308306546" name="Picture 1"/>
+            <wp:cNvGraphicFramePr>
+              <a:graphicFrameLocks xmlns:a="http://schemas.openxmlformats.org/drawingml/2006/main" noChangeAspect="1"/>
+            </wp:cNvGraphicFramePr>
+            <a:graphic xmlns:a="http://schemas.openxmlformats.org/drawingml/2006/main">
+              <a:graphicData uri="http://schemas.openxmlformats.org/drawingml/2006/picture">
+                <pic:pic xmlns:pic="http://schemas.openxmlformats.org/drawingml/2006/picture">
+                  <pic:nvPicPr>
+                    <pic:cNvPr id="308306546" name=""/>
+                    <pic:cNvPicPr/>
+                  </pic:nvPicPr>
+                  <pic:blipFill>
+                    <a:blip r:embed="rId25">
+                      <a:extLst>
+                        <a:ext uri="{28A0092B-C50C-407E-A947-70E740481C1C}">
+                          <a14:useLocalDpi xmlns:a14="http://schemas.microsoft.com/office/drawing/2010/main" val="0"/>
+                        </a:ext>
+                      </a:extLst>
+                    </a:blip>
+                    <a:stretch>
+                      <a:fillRect/>
+                    </a:stretch>
+                  </pic:blipFill>
+                  <pic:spPr>
+                    <a:xfrm>
+                      <a:off x="0" y="0"/>
+                      <a:ext cx="3848433" cy="396274"/>
+                    </a:xfrm>
+                    <a:prstGeom prst="rect">
+                      <a:avLst/>
+                    </a:prstGeom>
+                    <a:ln w="3175" cap="sq">
+                      <a:solidFill>
+                        <a:srgbClr val="000000"/>
+                      </a:solidFill>
+                      <a:prstDash val="solid"/>
+                      <a:miter lim="800000"/>
+                    </a:ln>
+                    <a:effectLst>
+                      <a:outerShdw blurRad="50800" dist="38100" dir="2700000" algn="tl" rotWithShape="0">
+                        <a:srgbClr val="000000">
+                          <a:alpha val="43000"/>
+                        </a:srgbClr>
+                      </a:outerShdw>
+                    </a:effectLst>
+                  </pic:spPr>
+                </pic:pic>
+              </a:graphicData>
+            </a:graphic>
+          </wp:inline>
+        </w:drawing>
+      </w:r>
+    </w:p>
+    <w:p>
+      <w:pPr>
+        <w:pStyle w:val="ListParagraph"/>
+        <w:numPr>
+          <w:ilvl w:val="0"/>
+          <w:numId w:val="22"/>
+        </w:numPr>
+        <w:spacing w:line="276" w:lineRule="auto"/>
+      </w:pPr>
+      <w:r>
+        <w:t>Next,</w:t>
+      </w:r>
+      <w:r>
+        <w:t xml:space="preserve"> </w:t>
+      </w:r>
+      <w:r>
+        <w:t xml:space="preserve">I want to </w:t>
+      </w:r>
+      <w:r>
+        <w:t xml:space="preserve">clone from online </w:t>
+      </w:r>
+      <w:r>
+        <w:t>GitHub</w:t>
+      </w:r>
+      <w:r>
+        <w:t xml:space="preserve"> to</w:t>
+      </w:r>
+      <w:r>
+        <w:t xml:space="preserve"> my</w:t>
+      </w:r>
+      <w:r>
+        <w:t xml:space="preserve"> local, I </w:t>
+      </w:r>
+      <w:r>
+        <w:t xml:space="preserve">will </w:t>
+      </w:r>
+      <w:r>
+        <w:t>use this:</w:t>
+      </w:r>
+    </w:p>
+    <w:p>
+      <w:pPr>
+        <w:pStyle w:val="ListParagraph"/>
+        <w:spacing w:line="276" w:lineRule="auto"/>
+        <w:ind w:left="360"/>
+      </w:pPr>
+      <w:r>
+        <w:rPr>
+          <w:noProof/>
+        </w:rPr>
+        <w:drawing>
+          <wp:inline distT="0" distB="0" distL="0" distR="0" wp14:anchorId="3E810E6B" wp14:editId="43E77ADA">
+            <wp:extent cx="6302286" cy="1463167"/>
+            <wp:effectExtent l="38100" t="38100" r="99060" b="99060"/>
+            <wp:docPr id="1590450862" name="Picture 1"/>
+            <wp:cNvGraphicFramePr>
+              <a:graphicFrameLocks xmlns:a="http://schemas.openxmlformats.org/drawingml/2006/main" noChangeAspect="1"/>
+            </wp:cNvGraphicFramePr>
+            <a:graphic xmlns:a="http://schemas.openxmlformats.org/drawingml/2006/main">
+              <a:graphicData uri="http://schemas.openxmlformats.org/drawingml/2006/picture">
+                <pic:pic xmlns:pic="http://schemas.openxmlformats.org/drawingml/2006/picture">
+                  <pic:nvPicPr>
+                    <pic:cNvPr id="1590450862" name=""/>
+                    <pic:cNvPicPr/>
+                  </pic:nvPicPr>
+                  <pic:blipFill>
+                    <a:blip r:embed="rId26">
+                      <a:extLst>
+                        <a:ext uri="{28A0092B-C50C-407E-A947-70E740481C1C}">
+                          <a14:useLocalDpi xmlns:a14="http://schemas.microsoft.com/office/drawing/2010/main" val="0"/>
+                        </a:ext>
+                      </a:extLst>
+                    </a:blip>
+                    <a:stretch>
+                      <a:fillRect/>
+                    </a:stretch>
+                  </pic:blipFill>
+                  <pic:spPr>
+                    <a:xfrm>
+                      <a:off x="0" y="0"/>
+                      <a:ext cx="6302286" cy="1463167"/>
+                    </a:xfrm>
+                    <a:prstGeom prst="rect">
+                      <a:avLst/>
+                    </a:prstGeom>
+                    <a:ln w="3175" cap="sq">
+                      <a:solidFill>
+                        <a:srgbClr val="000000"/>
+                      </a:solidFill>
+                      <a:prstDash val="solid"/>
+                      <a:miter lim="800000"/>
+                    </a:ln>
+                    <a:effectLst>
+                      <a:outerShdw blurRad="50800" dist="38100" dir="2700000" algn="tl" rotWithShape="0">
+                        <a:srgbClr val="000000">
+                          <a:alpha val="43000"/>
+                        </a:srgbClr>
+                      </a:outerShdw>
+                    </a:effectLst>
+                  </pic:spPr>
+                </pic:pic>
+              </a:graphicData>
+            </a:graphic>
+          </wp:inline>
+        </w:drawing>
+      </w:r>
+    </w:p>
+    <w:p>
+      <w:pPr>
+        <w:pStyle w:val="ListParagraph"/>
+        <w:numPr>
+          <w:ilvl w:val="0"/>
+          <w:numId w:val="22"/>
+        </w:numPr>
+        <w:spacing w:line="276" w:lineRule="auto"/>
+      </w:pPr>
+      <w:r>
+        <w:t>Check status:</w:t>
+      </w:r>
+    </w:p>
+    <w:p>
+      <w:pPr>
+        <w:pStyle w:val="ListParagraph"/>
+        <w:spacing w:line="276" w:lineRule="auto"/>
+        <w:ind w:left="360"/>
+      </w:pPr>
+      <w:r>
+        <w:rPr>
+          <w:noProof/>
+        </w:rPr>
+        <w:drawing>
+          <wp:inline distT="0" distB="0" distL="0" distR="0" wp14:anchorId="321EC4AD" wp14:editId="624B442A">
+            <wp:extent cx="4740051" cy="990686"/>
+            <wp:effectExtent l="38100" t="38100" r="99060" b="95250"/>
+            <wp:docPr id="1951680475" name="Picture 1"/>
+            <wp:cNvGraphicFramePr>
+              <a:graphicFrameLocks xmlns:a="http://schemas.openxmlformats.org/drawingml/2006/main" noChangeAspect="1"/>
+            </wp:cNvGraphicFramePr>
+            <a:graphic xmlns:a="http://schemas.openxmlformats.org/drawingml/2006/main">
+              <a:graphicData uri="http://schemas.openxmlformats.org/drawingml/2006/picture">
+                <pic:pic xmlns:pic="http://schemas.openxmlformats.org/drawingml/2006/picture">
+                  <pic:nvPicPr>
+                    <pic:cNvPr id="1951680475" name=""/>
+                    <pic:cNvPicPr/>
+                  </pic:nvPicPr>
+                  <pic:blipFill>
+                    <a:blip r:embed="rId27">
+                      <a:extLst>
+                        <a:ext uri="{28A0092B-C50C-407E-A947-70E740481C1C}">
+                          <a14:useLocalDpi xmlns:a14="http://schemas.microsoft.com/office/drawing/2010/main" val="0"/>
+                        </a:ext>
+                      </a:extLst>
+                    </a:blip>
+                    <a:stretch>
+                      <a:fillRect/>
+                    </a:stretch>
+                  </pic:blipFill>
+                  <pic:spPr>
+                    <a:xfrm>
+                      <a:off x="0" y="0"/>
+                      <a:ext cx="4740051" cy="990686"/>
+                    </a:xfrm>
+                    <a:prstGeom prst="rect">
+                      <a:avLst/>
+                    </a:prstGeom>
+                    <a:ln w="3175" cap="sq">
+                      <a:solidFill>
+                        <a:srgbClr val="000000"/>
+                      </a:solidFill>
+                      <a:prstDash val="solid"/>
+                      <a:miter lim="800000"/>
+                    </a:ln>
+                    <a:effectLst>
+                      <a:outerShdw blurRad="50800" dist="38100" dir="2700000" algn="tl" rotWithShape="0">
+                        <a:srgbClr val="000000">
+                          <a:alpha val="43000"/>
+                        </a:srgbClr>
+                      </a:outerShdw>
+                    </a:effectLst>
+                  </pic:spPr>
+                </pic:pic>
+              </a:graphicData>
+            </a:graphic>
+          </wp:inline>
+        </w:drawing>
+      </w:r>
+    </w:p>
+    <w:p>
+      <w:pPr>
+        <w:pStyle w:val="ListParagraph"/>
+        <w:numPr>
+          <w:ilvl w:val="0"/>
+          <w:numId w:val="22"/>
+        </w:numPr>
+        <w:spacing w:after="120" w:line="360" w:lineRule="auto"/>
+        <w:ind w:left="357" w:hanging="357"/>
+      </w:pPr>
+      <w:r>
+        <w:t xml:space="preserve">Now </w:t>
+      </w:r>
+      <w:r>
+        <w:t>the catch is that, a</w:t>
+      </w:r>
+      <w:r>
+        <w:t xml:space="preserve"> common mistake is assuming that all folders under a parent directory belong to the same Git repository.</w:t>
+      </w:r>
+    </w:p>
+    <w:p>
+      <w:pPr>
+        <w:pStyle w:val="ListParagraph"/>
+        <w:spacing w:line="276" w:lineRule="auto"/>
+        <w:ind w:left="360"/>
+      </w:pPr>
+      <w:r>
+        <w:rPr>
+          <w:noProof/>
+        </w:rPr>
+        <w:lastRenderedPageBreak/>
+        <w:drawing>
+          <wp:inline distT="0" distB="0" distL="0" distR="0" wp14:anchorId="74E6B26D" wp14:editId="65749AF1">
+            <wp:extent cx="4179277" cy="2678418"/>
+            <wp:effectExtent l="0" t="0" r="0" b="8255"/>
+            <wp:docPr id="2131004295" name="Picture 1"/>
+            <wp:cNvGraphicFramePr>
+              <a:graphicFrameLocks xmlns:a="http://schemas.openxmlformats.org/drawingml/2006/main" noChangeAspect="1"/>
+            </wp:cNvGraphicFramePr>
+            <a:graphic xmlns:a="http://schemas.openxmlformats.org/drawingml/2006/main">
+              <a:graphicData uri="http://schemas.openxmlformats.org/drawingml/2006/picture">
+                <pic:pic xmlns:pic="http://schemas.openxmlformats.org/drawingml/2006/picture">
+                  <pic:nvPicPr>
+                    <pic:cNvPr id="2131004295" name=""/>
+                    <pic:cNvPicPr/>
+                  </pic:nvPicPr>
+                  <pic:blipFill>
+                    <a:blip r:embed="rId28">
+                      <a:extLst>
+                        <a:ext uri="{28A0092B-C50C-407E-A947-70E740481C1C}">
+                          <a14:useLocalDpi xmlns:a14="http://schemas.microsoft.com/office/drawing/2010/main" val="0"/>
+                        </a:ext>
+                      </a:extLst>
+                    </a:blip>
+                    <a:stretch>
+                      <a:fillRect/>
+                    </a:stretch>
+                  </pic:blipFill>
+                  <pic:spPr>
+                    <a:xfrm>
+                      <a:off x="0" y="0"/>
+                      <a:ext cx="4200178" cy="2691813"/>
+                    </a:xfrm>
+                    <a:prstGeom prst="rect">
+                      <a:avLst/>
+                    </a:prstGeom>
+                  </pic:spPr>
+                </pic:pic>
+              </a:graphicData>
+            </a:graphic>
+          </wp:inline>
+        </w:drawing>
+      </w:r>
+    </w:p>
+    <w:p>
+      <w:pPr>
+        <w:pStyle w:val="ListParagraph"/>
+        <w:spacing w:after="0" w:line="276" w:lineRule="auto"/>
+        <w:ind w:left="360"/>
+      </w:pPr>
+      <w:r>
+        <w:rPr>
+          <w:b/>
+          <w:bCs/>
+        </w:rPr>
+        <w:t>Repository A:</w:t>
+      </w:r>
+      <w:r>
+        <w:t xml:space="preserve"> </w:t>
+      </w:r>
+      <w:r>
+        <w:t>D:\Github</w:t>
+      </w:r>
+    </w:p>
+    <w:p>
+      <w:pPr>
+        <w:pStyle w:val="ListParagraph"/>
+        <w:spacing w:line="420" w:lineRule="auto"/>
+        <w:ind w:left="357"/>
+      </w:pPr>
+      <w:r>
+        <w:t>Connected to:</w:t>
+      </w:r>
+      <w:r>
+        <w:t xml:space="preserve"> </w:t>
+      </w:r>
+      <w:hyperlink r:id="rId29" w:history="1">
+        <w:r>
+          <w:rPr>
+            <w:rStyle w:val="Hyperlink"/>
+          </w:rPr>
+          <w:t>https://github.com/vkabdwal/vscode_vk.git</w:t>
+        </w:r>
+      </w:hyperlink>
+    </w:p>
+    <w:p>
+      <w:pPr>
+        <w:pStyle w:val="ListParagraph"/>
+        <w:spacing w:after="0" w:line="276" w:lineRule="auto"/>
+        <w:ind w:left="360"/>
+      </w:pPr>
+      <w:r>
+        <w:rPr>
+          <w:b/>
+          <w:bCs/>
+        </w:rPr>
+        <w:t>Repository B</w:t>
+      </w:r>
+      <w:r>
+        <w:t>:</w:t>
+      </w:r>
+      <w:r>
+        <w:t xml:space="preserve"> </w:t>
+      </w:r>
+      <w:r>
+        <w:t>D:\Github\Complete-Python-Bootcamp</w:t>
+      </w:r>
+    </w:p>
+    <w:p>
+      <w:pPr>
+        <w:pStyle w:val="ListParagraph"/>
+        <w:spacing w:line="360" w:lineRule="auto"/>
+        <w:ind w:left="357"/>
+      </w:pPr>
+      <w:r>
+        <w:t>Connected to:</w:t>
+      </w:r>
+      <w:r>
+        <w:t xml:space="preserve"> </w:t>
+      </w:r>
+      <w:hyperlink r:id="rId30" w:history="1">
+        <w:r>
+          <w:rPr>
+            <w:rStyle w:val="Hyperlink"/>
+          </w:rPr>
+          <w:t>https://github.com/vkabdwal/Complete-Python-Bootcamp.git</w:t>
+        </w:r>
+      </w:hyperlink>
+    </w:p>
+    <w:p>
+      <w:pPr>
+        <w:pStyle w:val="ListParagraph"/>
+        <w:spacing w:line="276" w:lineRule="auto"/>
+        <w:ind w:left="360"/>
+      </w:pPr>
+      <w:r>
+        <w:rPr>
+          <w:b/>
+          <w:bCs/>
+        </w:rPr>
+        <w:t>Important Rule:</w:t>
+      </w:r>
+      <w:r>
+        <w:t xml:space="preserve"> </w:t>
+      </w:r>
+      <w:r>
+        <w:t xml:space="preserve">The folder that contains the </w:t>
+      </w:r>
+      <w:proofErr w:type="gramStart"/>
+      <w:r>
+        <w:t>".git</w:t>
+      </w:r>
+      <w:proofErr w:type="gramEnd"/>
+      <w:r>
+        <w:t>" directory is the repository root.</w:t>
+      </w:r>
+    </w:p>
+    <w:p>
+      <w:pPr>
+        <w:pStyle w:val="ListParagraph"/>
+        <w:spacing w:line="276" w:lineRule="auto"/>
+        <w:ind w:left="360"/>
+      </w:pPr>
+      <w:r>
+        <w:t xml:space="preserve">To determine which repository you are currently working in: </w:t>
+      </w:r>
+      <w:r>
+        <w:rPr>
+          <w:highlight w:val="lightGray"/>
+        </w:rPr>
+        <w:t>git rev-parse --show-</w:t>
+      </w:r>
+      <w:proofErr w:type="spellStart"/>
+      <w:r>
+        <w:rPr>
+          <w:highlight w:val="lightGray"/>
+        </w:rPr>
+        <w:t>toplevel</w:t>
+      </w:r>
+      <w:proofErr w:type="spellEnd"/>
+    </w:p>
+    <w:p>
+      <w:pPr>
+        <w:pStyle w:val="ListParagraph"/>
+        <w:spacing w:line="276" w:lineRule="auto"/>
+        <w:ind w:left="360"/>
+        <w:rPr>
+          <w:b/>
+          <w:bCs/>
+        </w:rPr>
+      </w:pPr>
+      <w:r>
+        <w:rPr>
+          <w:b/>
+          <w:bCs/>
+        </w:rPr>
+        <w:t>Examples:</w:t>
+      </w:r>
+    </w:p>
+    <w:p>
+      <w:pPr>
+        <w:pStyle w:val="ListParagraph"/>
+        <w:numPr>
+          <w:ilvl w:val="0"/>
+          <w:numId w:val="21"/>
+        </w:numPr>
+        <w:spacing w:line="276" w:lineRule="auto"/>
+      </w:pPr>
+      <w:r>
+        <w:t>If current location is:</w:t>
+      </w:r>
+      <w:r>
+        <w:t xml:space="preserve"> </w:t>
+      </w:r>
+      <w:r>
+        <w:t>D:\Github</w:t>
+      </w:r>
+    </w:p>
+    <w:p>
+      <w:pPr>
+        <w:pStyle w:val="ListParagraph"/>
+        <w:spacing w:line="360" w:lineRule="auto"/>
+        <w:ind w:left="360" w:firstLine="3"/>
+      </w:pPr>
+      <w:r>
+        <w:t>Git commands operate on:</w:t>
+      </w:r>
+      <w:r>
+        <w:t xml:space="preserve"> </w:t>
+      </w:r>
+      <w:hyperlink r:id="rId31" w:history="1">
+        <w:r>
+          <w:rPr>
+            <w:rStyle w:val="Hyperlink"/>
+          </w:rPr>
+          <w:t>https://github.com/vkabdwal/vscode_vk.git</w:t>
+        </w:r>
+      </w:hyperlink>
+    </w:p>
+    <w:p>
+      <w:pPr>
+        <w:pStyle w:val="ListParagraph"/>
+        <w:numPr>
+          <w:ilvl w:val="0"/>
+          <w:numId w:val="21"/>
+        </w:numPr>
+        <w:spacing w:line="276" w:lineRule="auto"/>
+      </w:pPr>
+      <w:r>
+        <w:t>If current location is:</w:t>
+      </w:r>
+      <w:r>
+        <w:t xml:space="preserve"> </w:t>
+      </w:r>
+      <w:r>
+        <w:t>D:\Github\Complete-Python-Bootcamp</w:t>
+      </w:r>
+    </w:p>
+    <w:p>
+      <w:pPr>
+        <w:pStyle w:val="ListParagraph"/>
+        <w:spacing w:line="360" w:lineRule="auto"/>
+        <w:ind w:left="357"/>
+      </w:pPr>
+      <w:r>
+        <w:t>Git commands operate on:</w:t>
+      </w:r>
+      <w:r>
+        <w:t xml:space="preserve"> </w:t>
+      </w:r>
+      <w:hyperlink r:id="rId32" w:history="1">
+        <w:r>
+          <w:rPr>
+            <w:rStyle w:val="Hyperlink"/>
+          </w:rPr>
+          <w:t>https://github.com/vkabdwal/Complete-Python-Bootcamp.git</w:t>
+        </w:r>
+      </w:hyperlink>
+    </w:p>
+    <w:p>
+      <w:pPr>
+        <w:pStyle w:val="ListParagraph"/>
+        <w:spacing w:line="276" w:lineRule="auto"/>
+        <w:ind w:left="360"/>
+        <w:rPr>
+          <w:b/>
+          <w:bCs/>
+        </w:rPr>
+      </w:pPr>
+      <w:r>
+        <w:rPr>
+          <w:b/>
+          <w:bCs/>
+        </w:rPr>
+        <w:t>Verify Before Every Push</w:t>
+      </w:r>
+    </w:p>
+    <w:p>
+      <w:pPr>
+        <w:pStyle w:val="ListParagraph"/>
+        <w:spacing w:line="276" w:lineRule="auto"/>
+        <w:ind w:left="360"/>
+      </w:pPr>
+      <w:r>
+        <w:t>Check current repository:</w:t>
+      </w:r>
+      <w:r>
+        <w:t xml:space="preserve"> </w:t>
+      </w:r>
+      <w:r>
+        <w:rPr>
+          <w:highlight w:val="lightGray"/>
+        </w:rPr>
+        <w:t>git remote -v</w:t>
+      </w:r>
+    </w:p>
+    <w:p>
+      <w:pPr>
+        <w:pStyle w:val="ListParagraph"/>
+        <w:spacing w:line="276" w:lineRule="auto"/>
+        <w:ind w:left="360"/>
+      </w:pPr>
+      <w:r>
+        <w:t>Check current branch:</w:t>
+      </w:r>
+      <w:r>
+        <w:t xml:space="preserve"> </w:t>
+      </w:r>
+      <w:r>
+        <w:rPr>
+          <w:highlight w:val="lightGray"/>
+        </w:rPr>
+        <w:t>git branch</w:t>
+      </w:r>
+    </w:p>
+    <w:p>
+      <w:pPr>
+        <w:pStyle w:val="ListParagraph"/>
+        <w:spacing w:line="276" w:lineRule="auto"/>
+        <w:ind w:left="360"/>
+      </w:pPr>
+      <w:r>
+        <w:t>Check current status:</w:t>
+      </w:r>
+      <w:r>
+        <w:t xml:space="preserve"> </w:t>
+      </w:r>
+      <w:r>
+        <w:rPr>
+          <w:highlight w:val="lightGray"/>
+        </w:rPr>
+        <w:t>git status</w:t>
+      </w:r>
+    </w:p>
+    <w:p>
+      <w:pPr>
+        <w:pStyle w:val="ListParagraph"/>
+        <w:spacing w:line="276" w:lineRule="auto"/>
+        <w:ind w:left="360"/>
+      </w:pPr>
+    </w:p>
+    <w:p>
+      <w:pPr>
+        <w:pStyle w:val="ListParagraph"/>
+        <w:spacing w:line="276" w:lineRule="auto"/>
+        <w:ind w:left="360"/>
+      </w:pPr>
+    </w:p>
+    <w:p>
+      <w:pPr>
+        <w:pStyle w:val="ListParagraph"/>
+        <w:spacing w:line="276" w:lineRule="auto"/>
+        <w:ind w:left="360"/>
+      </w:pPr>
+    </w:p>
+    <w:p>
+      <w:pPr>
+        <w:pStyle w:val="ListParagraph"/>
+        <w:spacing w:line="276" w:lineRule="auto"/>
+        <w:ind w:left="360"/>
+      </w:pPr>
+    </w:p>
+    <w:p>
+      <w:pPr>
+        <w:pStyle w:val="ListParagraph"/>
+        <w:spacing w:line="276" w:lineRule="auto"/>
+        <w:ind w:left="360"/>
+      </w:pPr>
+    </w:p>
+    <w:p>
+      <w:pPr>
+        <w:pStyle w:val="ListParagraph"/>
+        <w:spacing w:line="276" w:lineRule="auto"/>
+        <w:ind w:left="360"/>
+      </w:pPr>
+    </w:p>
+    <w:p>
+      <w:pPr>
+        <w:pStyle w:val="ListParagraph"/>
+        <w:spacing w:line="276" w:lineRule="auto"/>
+        <w:ind w:left="360"/>
+      </w:pPr>
+    </w:p>
+    <w:p>
+      <w:pPr>
+        <w:pStyle w:val="ListParagraph"/>
+        <w:spacing w:line="276" w:lineRule="auto"/>
+        <w:ind w:left="360"/>
+      </w:pPr>
+    </w:p>
     <w:sectPr>
       <w:pgSz w:w="11906" w:h="16838"/>
       <w:pgMar w:top="720" w:right="720" w:bottom="720" w:left="720" w:header="708" w:footer="708" w:gutter="0"/>
@@ -3286,17 +6372,17 @@
   <w:abstractNum w:abstractNumId="1" w15:restartNumberingAfterBreak="0">
     <w:nsid w:val="0B060F2F"/>
     <w:multiLevelType w:val="hybridMultilevel"/>
-    <w:tmpl w:val="85B4D6D2"/>
-    <w:lvl w:ilvl="0" w:tplc="40090001">
-      <w:start w:val="1"/>
-      <w:numFmt w:val="bullet"/>
-      <w:lvlText w:val=""/>
+    <w:tmpl w:val="385206AE"/>
+    <w:lvl w:ilvl="0" w:tplc="40090003">
+      <w:start w:val="1"/>
+      <w:numFmt w:val="bullet"/>
+      <w:lvlText w:val="o"/>
       <w:lvlJc w:val="left"/>
       <w:pPr>
         <w:ind w:left="360" w:hanging="360"/>
       </w:pPr>
       <w:rPr>
-        <w:rFonts w:ascii="Symbol" w:hAnsi="Symbol" w:hint="default"/>
+        <w:rFonts w:ascii="Courier New" w:hAnsi="Courier New" w:cs="Courier New" w:hint="default"/>
       </w:rPr>
     </w:lvl>
     <w:lvl w:ilvl="1" w:tplc="40090003" w:tentative="1">
@@ -3816,6 +6902,119 @@
     </w:lvl>
   </w:abstractNum>
   <w:abstractNum w:abstractNumId="5" w15:restartNumberingAfterBreak="0">
+    <w:nsid w:val="3A046E69"/>
+    <w:multiLevelType w:val="hybridMultilevel"/>
+    <w:tmpl w:val="C0F2B86A"/>
+    <w:lvl w:ilvl="0" w:tplc="40090003">
+      <w:start w:val="1"/>
+      <w:numFmt w:val="bullet"/>
+      <w:lvlText w:val="o"/>
+      <w:lvlJc w:val="left"/>
+      <w:pPr>
+        <w:ind w:left="360" w:hanging="360"/>
+      </w:pPr>
+      <w:rPr>
+        <w:rFonts w:ascii="Courier New" w:hAnsi="Courier New" w:cs="Courier New" w:hint="default"/>
+      </w:rPr>
+    </w:lvl>
+    <w:lvl w:ilvl="1" w:tplc="40090003" w:tentative="1">
+      <w:start w:val="1"/>
+      <w:numFmt w:val="bullet"/>
+      <w:lvlText w:val="o"/>
+      <w:lvlJc w:val="left"/>
+      <w:pPr>
+        <w:ind w:left="1080" w:hanging="360"/>
+      </w:pPr>
+      <w:rPr>
+        <w:rFonts w:ascii="Courier New" w:hAnsi="Courier New" w:cs="Courier New" w:hint="default"/>
+      </w:rPr>
+    </w:lvl>
+    <w:lvl w:ilvl="2" w:tplc="40090005" w:tentative="1">
+      <w:start w:val="1"/>
+      <w:numFmt w:val="bullet"/>
+      <w:lvlText w:val=""/>
+      <w:lvlJc w:val="left"/>
+      <w:pPr>
+        <w:ind w:left="1800" w:hanging="360"/>
+      </w:pPr>
+      <w:rPr>
+        <w:rFonts w:ascii="Wingdings" w:hAnsi="Wingdings" w:hint="default"/>
+      </w:rPr>
+    </w:lvl>
+    <w:lvl w:ilvl="3" w:tplc="40090001" w:tentative="1">
+      <w:start w:val="1"/>
+      <w:numFmt w:val="bullet"/>
+      <w:lvlText w:val=""/>
+      <w:lvlJc w:val="left"/>
+      <w:pPr>
+        <w:ind w:left="2520" w:hanging="360"/>
+      </w:pPr>
+      <w:rPr>
+        <w:rFonts w:ascii="Symbol" w:hAnsi="Symbol" w:hint="default"/>
+      </w:rPr>
+    </w:lvl>
+    <w:lvl w:ilvl="4" w:tplc="40090003" w:tentative="1">
+      <w:start w:val="1"/>
+      <w:numFmt w:val="bullet"/>
+      <w:lvlText w:val="o"/>
+      <w:lvlJc w:val="left"/>
+      <w:pPr>
+        <w:ind w:left="3240" w:hanging="360"/>
+      </w:pPr>
+      <w:rPr>
+        <w:rFonts w:ascii="Courier New" w:hAnsi="Courier New" w:cs="Courier New" w:hint="default"/>
+      </w:rPr>
+    </w:lvl>
+    <w:lvl w:ilvl="5" w:tplc="40090005" w:tentative="1">
+      <w:start w:val="1"/>
+      <w:numFmt w:val="bullet"/>
+      <w:lvlText w:val=""/>
+      <w:lvlJc w:val="left"/>
+      <w:pPr>
+        <w:ind w:left="3960" w:hanging="360"/>
+      </w:pPr>
+      <w:rPr>
+        <w:rFonts w:ascii="Wingdings" w:hAnsi="Wingdings" w:hint="default"/>
+      </w:rPr>
+    </w:lvl>
+    <w:lvl w:ilvl="6" w:tplc="40090001" w:tentative="1">
+      <w:start w:val="1"/>
+      <w:numFmt w:val="bullet"/>
+      <w:lvlText w:val=""/>
+      <w:lvlJc w:val="left"/>
+      <w:pPr>
+        <w:ind w:left="4680" w:hanging="360"/>
+      </w:pPr>
+      <w:rPr>
+        <w:rFonts w:ascii="Symbol" w:hAnsi="Symbol" w:hint="default"/>
+      </w:rPr>
+    </w:lvl>
+    <w:lvl w:ilvl="7" w:tplc="40090003" w:tentative="1">
+      <w:start w:val="1"/>
+      <w:numFmt w:val="bullet"/>
+      <w:lvlText w:val="o"/>
+      <w:lvlJc w:val="left"/>
+      <w:pPr>
+        <w:ind w:left="5400" w:hanging="360"/>
+      </w:pPr>
+      <w:rPr>
+        <w:rFonts w:ascii="Courier New" w:hAnsi="Courier New" w:cs="Courier New" w:hint="default"/>
+      </w:rPr>
+    </w:lvl>
+    <w:lvl w:ilvl="8" w:tplc="40090005" w:tentative="1">
+      <w:start w:val="1"/>
+      <w:numFmt w:val="bullet"/>
+      <w:lvlText w:val=""/>
+      <w:lvlJc w:val="left"/>
+      <w:pPr>
+        <w:ind w:left="6120" w:hanging="360"/>
+      </w:pPr>
+      <w:rPr>
+        <w:rFonts w:ascii="Wingdings" w:hAnsi="Wingdings" w:hint="default"/>
+      </w:rPr>
+    </w:lvl>
+  </w:abstractNum>
+  <w:abstractNum w:abstractNumId="6" w15:restartNumberingAfterBreak="0">
     <w:nsid w:val="402D2D7D"/>
     <w:multiLevelType w:val="hybridMultilevel"/>
     <w:tmpl w:val="67D03152"/>
@@ -3930,7 +7129,7 @@
       </w:rPr>
     </w:lvl>
   </w:abstractNum>
-  <w:abstractNum w:abstractNumId="6" w15:restartNumberingAfterBreak="0">
+  <w:abstractNum w:abstractNumId="7" w15:restartNumberingAfterBreak="0">
     <w:nsid w:val="460D35DD"/>
     <w:multiLevelType w:val="hybridMultilevel"/>
     <w:tmpl w:val="757ECAD2"/>
@@ -4021,7 +7220,7 @@
       </w:pPr>
     </w:lvl>
   </w:abstractNum>
-  <w:abstractNum w:abstractNumId="7" w15:restartNumberingAfterBreak="0">
+  <w:abstractNum w:abstractNumId="8" w15:restartNumberingAfterBreak="0">
     <w:nsid w:val="47DB6346"/>
     <w:multiLevelType w:val="multilevel"/>
     <w:tmpl w:val="8B26C70E"/>
@@ -4170,7 +7369,120 @@
       </w:rPr>
     </w:lvl>
   </w:abstractNum>
-  <w:abstractNum w:abstractNumId="8" w15:restartNumberingAfterBreak="0">
+  <w:abstractNum w:abstractNumId="9" w15:restartNumberingAfterBreak="0">
+    <w:nsid w:val="4C3132C0"/>
+    <w:multiLevelType w:val="hybridMultilevel"/>
+    <w:tmpl w:val="24FA146C"/>
+    <w:lvl w:ilvl="0" w:tplc="40090003">
+      <w:start w:val="1"/>
+      <w:numFmt w:val="bullet"/>
+      <w:lvlText w:val="o"/>
+      <w:lvlJc w:val="left"/>
+      <w:pPr>
+        <w:ind w:left="720" w:hanging="360"/>
+      </w:pPr>
+      <w:rPr>
+        <w:rFonts w:ascii="Courier New" w:hAnsi="Courier New" w:cs="Courier New" w:hint="default"/>
+      </w:rPr>
+    </w:lvl>
+    <w:lvl w:ilvl="1" w:tplc="40090003" w:tentative="1">
+      <w:start w:val="1"/>
+      <w:numFmt w:val="bullet"/>
+      <w:lvlText w:val="o"/>
+      <w:lvlJc w:val="left"/>
+      <w:pPr>
+        <w:ind w:left="1440" w:hanging="360"/>
+      </w:pPr>
+      <w:rPr>
+        <w:rFonts w:ascii="Courier New" w:hAnsi="Courier New" w:cs="Courier New" w:hint="default"/>
+      </w:rPr>
+    </w:lvl>
+    <w:lvl w:ilvl="2" w:tplc="40090005" w:tentative="1">
+      <w:start w:val="1"/>
+      <w:numFmt w:val="bullet"/>
+      <w:lvlText w:val=""/>
+      <w:lvlJc w:val="left"/>
+      <w:pPr>
+        <w:ind w:left="2160" w:hanging="360"/>
+      </w:pPr>
+      <w:rPr>
+        <w:rFonts w:ascii="Wingdings" w:hAnsi="Wingdings" w:hint="default"/>
+      </w:rPr>
+    </w:lvl>
+    <w:lvl w:ilvl="3" w:tplc="40090001" w:tentative="1">
+      <w:start w:val="1"/>
+      <w:numFmt w:val="bullet"/>
+      <w:lvlText w:val=""/>
+      <w:lvlJc w:val="left"/>
+      <w:pPr>
+        <w:ind w:left="2880" w:hanging="360"/>
+      </w:pPr>
+      <w:rPr>
+        <w:rFonts w:ascii="Symbol" w:hAnsi="Symbol" w:hint="default"/>
+      </w:rPr>
+    </w:lvl>
+    <w:lvl w:ilvl="4" w:tplc="40090003" w:tentative="1">
+      <w:start w:val="1"/>
+      <w:numFmt w:val="bullet"/>
+      <w:lvlText w:val="o"/>
+      <w:lvlJc w:val="left"/>
+      <w:pPr>
+        <w:ind w:left="3600" w:hanging="360"/>
+      </w:pPr>
+      <w:rPr>
+        <w:rFonts w:ascii="Courier New" w:hAnsi="Courier New" w:cs="Courier New" w:hint="default"/>
+      </w:rPr>
+    </w:lvl>
+    <w:lvl w:ilvl="5" w:tplc="40090005" w:tentative="1">
+      <w:start w:val="1"/>
+      <w:numFmt w:val="bullet"/>
+      <w:lvlText w:val=""/>
+      <w:lvlJc w:val="left"/>
+      <w:pPr>
+        <w:ind w:left="4320" w:hanging="360"/>
+      </w:pPr>
+      <w:rPr>
+        <w:rFonts w:ascii="Wingdings" w:hAnsi="Wingdings" w:hint="default"/>
+      </w:rPr>
+    </w:lvl>
+    <w:lvl w:ilvl="6" w:tplc="40090001" w:tentative="1">
+      <w:start w:val="1"/>
+      <w:numFmt w:val="bullet"/>
+      <w:lvlText w:val=""/>
+      <w:lvlJc w:val="left"/>
+      <w:pPr>
+        <w:ind w:left="5040" w:hanging="360"/>
+      </w:pPr>
+      <w:rPr>
+        <w:rFonts w:ascii="Symbol" w:hAnsi="Symbol" w:hint="default"/>
+      </w:rPr>
+    </w:lvl>
+    <w:lvl w:ilvl="7" w:tplc="40090003" w:tentative="1">
+      <w:start w:val="1"/>
+      <w:numFmt w:val="bullet"/>
+      <w:lvlText w:val="o"/>
+      <w:lvlJc w:val="left"/>
+      <w:pPr>
+        <w:ind w:left="5760" w:hanging="360"/>
+      </w:pPr>
+      <w:rPr>
+        <w:rFonts w:ascii="Courier New" w:hAnsi="Courier New" w:cs="Courier New" w:hint="default"/>
+      </w:rPr>
+    </w:lvl>
+    <w:lvl w:ilvl="8" w:tplc="40090005" w:tentative="1">
+      <w:start w:val="1"/>
+      <w:numFmt w:val="bullet"/>
+      <w:lvlText w:val=""/>
+      <w:lvlJc w:val="left"/>
+      <w:pPr>
+        <w:ind w:left="6480" w:hanging="360"/>
+      </w:pPr>
+      <w:rPr>
+        <w:rFonts w:ascii="Wingdings" w:hAnsi="Wingdings" w:hint="default"/>
+      </w:rPr>
+    </w:lvl>
+  </w:abstractNum>
+  <w:abstractNum w:abstractNumId="10" w15:restartNumberingAfterBreak="0">
     <w:nsid w:val="4F344D17"/>
     <w:multiLevelType w:val="hybridMultilevel"/>
     <w:tmpl w:val="50343250"/>
@@ -4283,7 +7595,7 @@
       </w:rPr>
     </w:lvl>
   </w:abstractNum>
-  <w:abstractNum w:abstractNumId="9" w15:restartNumberingAfterBreak="0">
+  <w:abstractNum w:abstractNumId="11" w15:restartNumberingAfterBreak="0">
     <w:nsid w:val="50BD270C"/>
     <w:multiLevelType w:val="multilevel"/>
     <w:tmpl w:val="401E2FCA"/>
@@ -4432,7 +7744,120 @@
       </w:rPr>
     </w:lvl>
   </w:abstractNum>
-  <w:abstractNum w:abstractNumId="10" w15:restartNumberingAfterBreak="0">
+  <w:abstractNum w:abstractNumId="12" w15:restartNumberingAfterBreak="0">
+    <w:nsid w:val="5A7465FF"/>
+    <w:multiLevelType w:val="hybridMultilevel"/>
+    <w:tmpl w:val="1BE2F00E"/>
+    <w:lvl w:ilvl="0" w:tplc="4009000B">
+      <w:start w:val="1"/>
+      <w:numFmt w:val="bullet"/>
+      <w:lvlText w:val=""/>
+      <w:lvlJc w:val="left"/>
+      <w:pPr>
+        <w:ind w:left="360" w:hanging="360"/>
+      </w:pPr>
+      <w:rPr>
+        <w:rFonts w:ascii="Wingdings" w:hAnsi="Wingdings" w:hint="default"/>
+      </w:rPr>
+    </w:lvl>
+    <w:lvl w:ilvl="1" w:tplc="40090003" w:tentative="1">
+      <w:start w:val="1"/>
+      <w:numFmt w:val="bullet"/>
+      <w:lvlText w:val="o"/>
+      <w:lvlJc w:val="left"/>
+      <w:pPr>
+        <w:ind w:left="1080" w:hanging="360"/>
+      </w:pPr>
+      <w:rPr>
+        <w:rFonts w:ascii="Courier New" w:hAnsi="Courier New" w:cs="Courier New" w:hint="default"/>
+      </w:rPr>
+    </w:lvl>
+    <w:lvl w:ilvl="2" w:tplc="40090005" w:tentative="1">
+      <w:start w:val="1"/>
+      <w:numFmt w:val="bullet"/>
+      <w:lvlText w:val=""/>
+      <w:lvlJc w:val="left"/>
+      <w:pPr>
+        <w:ind w:left="1800" w:hanging="360"/>
+      </w:pPr>
+      <w:rPr>
+        <w:rFonts w:ascii="Wingdings" w:hAnsi="Wingdings" w:hint="default"/>
+      </w:rPr>
+    </w:lvl>
+    <w:lvl w:ilvl="3" w:tplc="40090001" w:tentative="1">
+      <w:start w:val="1"/>
+      <w:numFmt w:val="bullet"/>
+      <w:lvlText w:val=""/>
+      <w:lvlJc w:val="left"/>
+      <w:pPr>
+        <w:ind w:left="2520" w:hanging="360"/>
+      </w:pPr>
+      <w:rPr>
+        <w:rFonts w:ascii="Symbol" w:hAnsi="Symbol" w:hint="default"/>
+      </w:rPr>
+    </w:lvl>
+    <w:lvl w:ilvl="4" w:tplc="40090003" w:tentative="1">
+      <w:start w:val="1"/>
+      <w:numFmt w:val="bullet"/>
+      <w:lvlText w:val="o"/>
+      <w:lvlJc w:val="left"/>
+      <w:pPr>
+        <w:ind w:left="3240" w:hanging="360"/>
+      </w:pPr>
+      <w:rPr>
+        <w:rFonts w:ascii="Courier New" w:hAnsi="Courier New" w:cs="Courier New" w:hint="default"/>
+      </w:rPr>
+    </w:lvl>
+    <w:lvl w:ilvl="5" w:tplc="40090005" w:tentative="1">
+      <w:start w:val="1"/>
+      <w:numFmt w:val="bullet"/>
+      <w:lvlText w:val=""/>
+      <w:lvlJc w:val="left"/>
+      <w:pPr>
+        <w:ind w:left="3960" w:hanging="360"/>
+      </w:pPr>
+      <w:rPr>
+        <w:rFonts w:ascii="Wingdings" w:hAnsi="Wingdings" w:hint="default"/>
+      </w:rPr>
+    </w:lvl>
+    <w:lvl w:ilvl="6" w:tplc="40090001" w:tentative="1">
+      <w:start w:val="1"/>
+      <w:numFmt w:val="bullet"/>
+      <w:lvlText w:val=""/>
+      <w:lvlJc w:val="left"/>
+      <w:pPr>
+        <w:ind w:left="4680" w:hanging="360"/>
+      </w:pPr>
+      <w:rPr>
+        <w:rFonts w:ascii="Symbol" w:hAnsi="Symbol" w:hint="default"/>
+      </w:rPr>
+    </w:lvl>
+    <w:lvl w:ilvl="7" w:tplc="40090003" w:tentative="1">
+      <w:start w:val="1"/>
+      <w:numFmt w:val="bullet"/>
+      <w:lvlText w:val="o"/>
+      <w:lvlJc w:val="left"/>
+      <w:pPr>
+        <w:ind w:left="5400" w:hanging="360"/>
+      </w:pPr>
+      <w:rPr>
+        <w:rFonts w:ascii="Courier New" w:hAnsi="Courier New" w:cs="Courier New" w:hint="default"/>
+      </w:rPr>
+    </w:lvl>
+    <w:lvl w:ilvl="8" w:tplc="40090005" w:tentative="1">
+      <w:start w:val="1"/>
+      <w:numFmt w:val="bullet"/>
+      <w:lvlText w:val=""/>
+      <w:lvlJc w:val="left"/>
+      <w:pPr>
+        <w:ind w:left="6120" w:hanging="360"/>
+      </w:pPr>
+      <w:rPr>
+        <w:rFonts w:ascii="Wingdings" w:hAnsi="Wingdings" w:hint="default"/>
+      </w:rPr>
+    </w:lvl>
+  </w:abstractNum>
+  <w:abstractNum w:abstractNumId="13" w15:restartNumberingAfterBreak="0">
     <w:nsid w:val="62C97494"/>
     <w:multiLevelType w:val="multilevel"/>
     <w:tmpl w:val="271E10DA"/>
@@ -4581,7 +8006,7 @@
       </w:rPr>
     </w:lvl>
   </w:abstractNum>
-  <w:abstractNum w:abstractNumId="11" w15:restartNumberingAfterBreak="0">
+  <w:abstractNum w:abstractNumId="14" w15:restartNumberingAfterBreak="0">
     <w:nsid w:val="644D221E"/>
     <w:multiLevelType w:val="multilevel"/>
     <w:tmpl w:val="2814D62A"/>
@@ -4730,7 +8155,7 @@
       </w:rPr>
     </w:lvl>
   </w:abstractNum>
-  <w:abstractNum w:abstractNumId="12" w15:restartNumberingAfterBreak="0">
+  <w:abstractNum w:abstractNumId="15" w15:restartNumberingAfterBreak="0">
     <w:nsid w:val="6B6C4ED5"/>
     <w:multiLevelType w:val="hybridMultilevel"/>
     <w:tmpl w:val="EA8CADF0"/>
@@ -4845,7 +8270,7 @@
       </w:rPr>
     </w:lvl>
   </w:abstractNum>
-  <w:abstractNum w:abstractNumId="13" w15:restartNumberingAfterBreak="0">
+  <w:abstractNum w:abstractNumId="16" w15:restartNumberingAfterBreak="0">
     <w:nsid w:val="6C3D1E81"/>
     <w:multiLevelType w:val="hybridMultilevel"/>
     <w:tmpl w:val="31562872"/>
@@ -4958,7 +8383,7 @@
       </w:rPr>
     </w:lvl>
   </w:abstractNum>
-  <w:abstractNum w:abstractNumId="14" w15:restartNumberingAfterBreak="0">
+  <w:abstractNum w:abstractNumId="17" w15:restartNumberingAfterBreak="0">
     <w:nsid w:val="6C9862C5"/>
     <w:multiLevelType w:val="hybridMultilevel"/>
     <w:tmpl w:val="BFFEE9E8"/>
@@ -5071,7 +8496,7 @@
       </w:rPr>
     </w:lvl>
   </w:abstractNum>
-  <w:abstractNum w:abstractNumId="15" w15:restartNumberingAfterBreak="0">
+  <w:abstractNum w:abstractNumId="18" w15:restartNumberingAfterBreak="0">
     <w:nsid w:val="6FE875EB"/>
     <w:multiLevelType w:val="hybridMultilevel"/>
     <w:tmpl w:val="34CCF8D4"/>
@@ -5184,7 +8609,7 @@
       </w:rPr>
     </w:lvl>
   </w:abstractNum>
-  <w:abstractNum w:abstractNumId="16" w15:restartNumberingAfterBreak="0">
+  <w:abstractNum w:abstractNumId="19" w15:restartNumberingAfterBreak="0">
     <w:nsid w:val="74DC65A0"/>
     <w:multiLevelType w:val="multilevel"/>
     <w:tmpl w:val="EFE27236"/>
@@ -5333,7 +8758,7 @@
       </w:rPr>
     </w:lvl>
   </w:abstractNum>
-  <w:abstractNum w:abstractNumId="17" w15:restartNumberingAfterBreak="0">
+  <w:abstractNum w:abstractNumId="20" w15:restartNumberingAfterBreak="0">
     <w:nsid w:val="7535507D"/>
     <w:multiLevelType w:val="multilevel"/>
     <w:tmpl w:val="FF10B904"/>
@@ -5482,7 +8907,7 @@
       </w:rPr>
     </w:lvl>
   </w:abstractNum>
-  <w:abstractNum w:abstractNumId="18" w15:restartNumberingAfterBreak="0">
+  <w:abstractNum w:abstractNumId="21" w15:restartNumberingAfterBreak="0">
     <w:nsid w:val="7A77718A"/>
     <w:multiLevelType w:val="hybridMultilevel"/>
     <w:tmpl w:val="25BC0684"/>
@@ -5595,29 +9020,142 @@
       </w:rPr>
     </w:lvl>
   </w:abstractNum>
+  <w:abstractNum w:abstractNumId="22" w15:restartNumberingAfterBreak="0">
+    <w:nsid w:val="7F891154"/>
+    <w:multiLevelType w:val="hybridMultilevel"/>
+    <w:tmpl w:val="0A0AA5E6"/>
+    <w:lvl w:ilvl="0" w:tplc="40090003">
+      <w:start w:val="1"/>
+      <w:numFmt w:val="bullet"/>
+      <w:lvlText w:val="o"/>
+      <w:lvlJc w:val="left"/>
+      <w:pPr>
+        <w:ind w:left="1077" w:hanging="360"/>
+      </w:pPr>
+      <w:rPr>
+        <w:rFonts w:ascii="Courier New" w:hAnsi="Courier New" w:cs="Courier New" w:hint="default"/>
+      </w:rPr>
+    </w:lvl>
+    <w:lvl w:ilvl="1" w:tplc="40090003" w:tentative="1">
+      <w:start w:val="1"/>
+      <w:numFmt w:val="bullet"/>
+      <w:lvlText w:val="o"/>
+      <w:lvlJc w:val="left"/>
+      <w:pPr>
+        <w:ind w:left="1797" w:hanging="360"/>
+      </w:pPr>
+      <w:rPr>
+        <w:rFonts w:ascii="Courier New" w:hAnsi="Courier New" w:cs="Courier New" w:hint="default"/>
+      </w:rPr>
+    </w:lvl>
+    <w:lvl w:ilvl="2" w:tplc="40090005" w:tentative="1">
+      <w:start w:val="1"/>
+      <w:numFmt w:val="bullet"/>
+      <w:lvlText w:val=""/>
+      <w:lvlJc w:val="left"/>
+      <w:pPr>
+        <w:ind w:left="2517" w:hanging="360"/>
+      </w:pPr>
+      <w:rPr>
+        <w:rFonts w:ascii="Wingdings" w:hAnsi="Wingdings" w:hint="default"/>
+      </w:rPr>
+    </w:lvl>
+    <w:lvl w:ilvl="3" w:tplc="40090001" w:tentative="1">
+      <w:start w:val="1"/>
+      <w:numFmt w:val="bullet"/>
+      <w:lvlText w:val=""/>
+      <w:lvlJc w:val="left"/>
+      <w:pPr>
+        <w:ind w:left="3237" w:hanging="360"/>
+      </w:pPr>
+      <w:rPr>
+        <w:rFonts w:ascii="Symbol" w:hAnsi="Symbol" w:hint="default"/>
+      </w:rPr>
+    </w:lvl>
+    <w:lvl w:ilvl="4" w:tplc="40090003" w:tentative="1">
+      <w:start w:val="1"/>
+      <w:numFmt w:val="bullet"/>
+      <w:lvlText w:val="o"/>
+      <w:lvlJc w:val="left"/>
+      <w:pPr>
+        <w:ind w:left="3957" w:hanging="360"/>
+      </w:pPr>
+      <w:rPr>
+        <w:rFonts w:ascii="Courier New" w:hAnsi="Courier New" w:cs="Courier New" w:hint="default"/>
+      </w:rPr>
+    </w:lvl>
+    <w:lvl w:ilvl="5" w:tplc="40090005" w:tentative="1">
+      <w:start w:val="1"/>
+      <w:numFmt w:val="bullet"/>
+      <w:lvlText w:val=""/>
+      <w:lvlJc w:val="left"/>
+      <w:pPr>
+        <w:ind w:left="4677" w:hanging="360"/>
+      </w:pPr>
+      <w:rPr>
+        <w:rFonts w:ascii="Wingdings" w:hAnsi="Wingdings" w:hint="default"/>
+      </w:rPr>
+    </w:lvl>
+    <w:lvl w:ilvl="6" w:tplc="40090001" w:tentative="1">
+      <w:start w:val="1"/>
+      <w:numFmt w:val="bullet"/>
+      <w:lvlText w:val=""/>
+      <w:lvlJc w:val="left"/>
+      <w:pPr>
+        <w:ind w:left="5397" w:hanging="360"/>
+      </w:pPr>
+      <w:rPr>
+        <w:rFonts w:ascii="Symbol" w:hAnsi="Symbol" w:hint="default"/>
+      </w:rPr>
+    </w:lvl>
+    <w:lvl w:ilvl="7" w:tplc="40090003" w:tentative="1">
+      <w:start w:val="1"/>
+      <w:numFmt w:val="bullet"/>
+      <w:lvlText w:val="o"/>
+      <w:lvlJc w:val="left"/>
+      <w:pPr>
+        <w:ind w:left="6117" w:hanging="360"/>
+      </w:pPr>
+      <w:rPr>
+        <w:rFonts w:ascii="Courier New" w:hAnsi="Courier New" w:cs="Courier New" w:hint="default"/>
+      </w:rPr>
+    </w:lvl>
+    <w:lvl w:ilvl="8" w:tplc="40090005" w:tentative="1">
+      <w:start w:val="1"/>
+      <w:numFmt w:val="bullet"/>
+      <w:lvlText w:val=""/>
+      <w:lvlJc w:val="left"/>
+      <w:pPr>
+        <w:ind w:left="6837" w:hanging="360"/>
+      </w:pPr>
+      <w:rPr>
+        <w:rFonts w:ascii="Wingdings" w:hAnsi="Wingdings" w:hint="default"/>
+      </w:rPr>
+    </w:lvl>
+  </w:abstractNum>
   <w:num w:numId="1" w16cid:durableId="1541211281">
-    <w:abstractNumId w:val="9"/>
+    <w:abstractNumId w:val="11"/>
   </w:num>
   <w:num w:numId="2" w16cid:durableId="1669820214">
     <w:abstractNumId w:val="0"/>
   </w:num>
   <w:num w:numId="3" w16cid:durableId="957224679">
-    <w:abstractNumId w:val="17"/>
+    <w:abstractNumId w:val="20"/>
   </w:num>
   <w:num w:numId="4" w16cid:durableId="2059433098">
-    <w:abstractNumId w:val="16"/>
+    <w:abstractNumId w:val="19"/>
   </w:num>
   <w:num w:numId="5" w16cid:durableId="512651252">
-    <w:abstractNumId w:val="5"/>
+    <w:abstractNumId w:val="6"/>
   </w:num>
   <w:num w:numId="6" w16cid:durableId="266815997">
-    <w:abstractNumId w:val="7"/>
+    <w:abstractNumId w:val="8"/>
   </w:num>
   <w:num w:numId="7" w16cid:durableId="973407237">
-    <w:abstractNumId w:val="12"/>
+    <w:abstractNumId w:val="15"/>
   </w:num>
   <w:num w:numId="8" w16cid:durableId="1531457731">
-    <w:abstractNumId w:val="6"/>
+    <w:abstractNumId w:val="7"/>
   </w:num>
   <w:num w:numId="9" w16cid:durableId="1674137602">
     <w:abstractNumId w:val="2"/>
@@ -5626,31 +9164,43 @@
     <w:abstractNumId w:val="4"/>
   </w:num>
   <w:num w:numId="11" w16cid:durableId="1659848006">
-    <w:abstractNumId w:val="11"/>
+    <w:abstractNumId w:val="14"/>
   </w:num>
   <w:num w:numId="12" w16cid:durableId="1647930430">
     <w:abstractNumId w:val="3"/>
   </w:num>
   <w:num w:numId="13" w16cid:durableId="1627470677">
+    <w:abstractNumId w:val="13"/>
+  </w:num>
+  <w:num w:numId="14" w16cid:durableId="932083569">
+    <w:abstractNumId w:val="17"/>
+  </w:num>
+  <w:num w:numId="15" w16cid:durableId="1741635326">
     <w:abstractNumId w:val="10"/>
   </w:num>
-  <w:num w:numId="14" w16cid:durableId="932083569">
-    <w:abstractNumId w:val="14"/>
-  </w:num>
-  <w:num w:numId="15" w16cid:durableId="1741635326">
-    <w:abstractNumId w:val="8"/>
-  </w:num>
   <w:num w:numId="16" w16cid:durableId="2097357441">
-    <w:abstractNumId w:val="13"/>
+    <w:abstractNumId w:val="16"/>
   </w:num>
   <w:num w:numId="17" w16cid:durableId="1175731006">
-    <w:abstractNumId w:val="18"/>
+    <w:abstractNumId w:val="21"/>
   </w:num>
   <w:num w:numId="18" w16cid:durableId="1788087385">
-    <w:abstractNumId w:val="15"/>
+    <w:abstractNumId w:val="18"/>
   </w:num>
   <w:num w:numId="19" w16cid:durableId="1722636964">
     <w:abstractNumId w:val="1"/>
+  </w:num>
+  <w:num w:numId="20" w16cid:durableId="1935817975">
+    <w:abstractNumId w:val="22"/>
+  </w:num>
+  <w:num w:numId="21" w16cid:durableId="1385059155">
+    <w:abstractNumId w:val="9"/>
+  </w:num>
+  <w:num w:numId="22" w16cid:durableId="1899393260">
+    <w:abstractNumId w:val="12"/>
+  </w:num>
+  <w:num w:numId="23" w16cid:durableId="699815963">
+    <w:abstractNumId w:val="5"/>
   </w:num>
 </w:numbering>
 </file>
@@ -6258,7 +9808,6 @@
   <w:style w:type="character" w:default="1" w:styleId="DefaultParagraphFont">
     <w:name w:val="Default Paragraph Font"/>
     <w:uiPriority w:val="1"/>
-    <w:semiHidden/>
     <w:unhideWhenUsed/>
   </w:style>
   <w:style w:type="table" w:default="1" w:styleId="TableNormal">
@@ -6624,6 +10173,17 @@
       <w:shd w:val="clear" w:color="auto" w:fill="E1DFDD"/>
     </w:rPr>
   </w:style>
+  <w:style w:type="paragraph" w:styleId="NormalWeb">
+    <w:name w:val="Normal (Web)"/>
+    <w:basedOn w:val="Normal"/>
+    <w:uiPriority w:val="99"/>
+    <w:semiHidden/>
+    <w:unhideWhenUsed/>
+    <w:rsid w:val="008B37C6"/>
+    <w:rPr>
+      <w:rFonts w:ascii="Times New Roman" w:hAnsi="Times New Roman" w:cs="Times New Roman"/>
+    </w:rPr>
+  </w:style>
 </w:styles>
 </file>
 

</xml_diff>